<commit_message>
docs: migrating to obsidian
</commit_message>
<xml_diff>
--- a/d1_dart_null_safety.docx
+++ b/d1_dart_null_safety.docx
@@ -252,15 +252,23 @@
           <w:sz w:val="32"/>
           <w:szCs w:val="32"/>
         </w:rPr>
-        <w:t>Null-coalescing/aware Assignment Recap…………</w:t>
-      </w:r>
-      <w:r>
-        <w:rPr>
-          <w:rFonts w:cs="Calibri"/>
-          <w:sz w:val="32"/>
-          <w:szCs w:val="32"/>
-        </w:rPr>
-        <w:t>……………….</w:t>
+        <w:t>Null Assertion……………………………</w:t>
+      </w:r>
+      <w:r>
+        <w:rPr>
+          <w:rFonts w:cs="Calibri"/>
+          <w:sz w:val="32"/>
+          <w:szCs w:val="32"/>
+        </w:rPr>
+        <w:t>………………………………</w:t>
+      </w:r>
+      <w:r>
+        <w:rPr>
+          <w:rFonts w:cs="Calibri"/>
+          <w:sz w:val="32"/>
+          <w:szCs w:val="32"/>
+        </w:rPr>
+        <w:t>…...</w:t>
       </w:r>
       <w:r>
         <w:rPr>
@@ -291,31 +299,39 @@
           <w:sz w:val="32"/>
           <w:szCs w:val="32"/>
         </w:rPr>
-        <w:t>Null Assertion……………………………</w:t>
-      </w:r>
-      <w:r>
-        <w:rPr>
-          <w:rFonts w:cs="Calibri"/>
-          <w:sz w:val="32"/>
-          <w:szCs w:val="32"/>
-        </w:rPr>
-        <w:t>………………………………</w:t>
-      </w:r>
-      <w:r>
-        <w:rPr>
-          <w:rFonts w:cs="Calibri"/>
-          <w:sz w:val="32"/>
-          <w:szCs w:val="32"/>
-        </w:rPr>
-        <w:t>…...</w:t>
-      </w:r>
-      <w:r>
-        <w:rPr>
-          <w:rFonts w:cs="Calibri"/>
-          <w:sz w:val="32"/>
-          <w:szCs w:val="32"/>
-        </w:rPr>
-        <w:t>4</w:t>
+        <w:t>Null Aware Operator in List and Map…………………</w:t>
+      </w:r>
+      <w:r>
+        <w:rPr>
+          <w:rFonts w:cs="Calibri"/>
+          <w:sz w:val="32"/>
+          <w:szCs w:val="32"/>
+        </w:rPr>
+        <w:t>………………</w:t>
+      </w:r>
+      <w:r>
+        <w:rPr>
+          <w:rFonts w:cs="Calibri"/>
+          <w:sz w:val="32"/>
+          <w:szCs w:val="32"/>
+        </w:rPr>
+        <w:t>..</w:t>
+      </w:r>
+      <w:r>
+        <w:rPr>
+          <w:rFonts w:cs="Calibri"/>
+          <w:sz w:val="32"/>
+          <w:szCs w:val="32"/>
+        </w:rPr>
+        <w:t>.</w:t>
+      </w:r>
+      <w:r>
+        <w:rPr>
+          <w:rFonts w:cs="Calibri"/>
+          <w:sz w:val="32"/>
+          <w:szCs w:val="32"/>
+        </w:rPr>
+        <w:t>5</w:t>
       </w:r>
     </w:p>
     <w:p>
@@ -335,10 +351,20 @@
       <w:r>
         <w:rPr>
           <w:rFonts w:cs="Calibri"/>
-          <w:sz w:val="32"/>
-          <w:szCs w:val="32"/>
-        </w:rPr>
-        <w:t>Null Aware Operator in List and Map…………………</w:t>
+          <w:b/>
+          <w:bCs/>
+          <w:sz w:val="32"/>
+          <w:szCs w:val="32"/>
+        </w:rPr>
+        <w:t>Late</w:t>
+      </w:r>
+      <w:r>
+        <w:rPr>
+          <w:rFonts w:cs="Calibri"/>
+          <w:sz w:val="32"/>
+          <w:szCs w:val="32"/>
+        </w:rPr>
+        <w:t xml:space="preserve"> keyword…………………………………………………</w:t>
       </w:r>
       <w:r>
         <w:rPr>
@@ -347,14 +373,6 @@
           <w:szCs w:val="32"/>
         </w:rPr>
         <w:t>………………</w:t>
-      </w:r>
-      <w:r>
-        <w:rPr>
-          <w:rFonts w:cs="Calibri"/>
-          <w:sz w:val="32"/>
-          <w:szCs w:val="32"/>
-        </w:rPr>
-        <w:t>..</w:t>
       </w:r>
       <w:r>
         <w:rPr>
@@ -390,28 +408,34 @@
       <w:r>
         <w:rPr>
           <w:rFonts w:cs="Calibri"/>
-          <w:b/>
-          <w:bCs/>
-          <w:sz w:val="32"/>
-          <w:szCs w:val="32"/>
-        </w:rPr>
-        <w:t>Late</w:t>
-      </w:r>
-      <w:r>
-        <w:rPr>
-          <w:rFonts w:cs="Calibri"/>
-          <w:sz w:val="32"/>
-          <w:szCs w:val="32"/>
-        </w:rPr>
-        <w:t xml:space="preserve"> keyword…………………………………………………</w:t>
-      </w:r>
-      <w:r>
-        <w:rPr>
-          <w:rFonts w:cs="Calibri"/>
-          <w:sz w:val="32"/>
-          <w:szCs w:val="32"/>
-        </w:rPr>
-        <w:t>………………</w:t>
+          <w:sz w:val="32"/>
+          <w:szCs w:val="32"/>
+        </w:rPr>
+        <w:t>Final Takeaway………………………</w:t>
+      </w:r>
+      <w:r>
+        <w:rPr>
+          <w:rFonts w:cs="Calibri"/>
+          <w:sz w:val="32"/>
+          <w:szCs w:val="32"/>
+        </w:rPr>
+        <w:t>….</w:t>
+      </w:r>
+      <w:r>
+        <w:rPr>
+          <w:rFonts w:cs="Calibri"/>
+          <w:sz w:val="32"/>
+          <w:szCs w:val="32"/>
+        </w:rPr>
+        <w:t>……………</w:t>
+      </w:r>
+      <w:r>
+        <w:rPr>
+          <w:rFonts w:cs="Calibri"/>
+          <w:sz w:val="32"/>
+          <w:szCs w:val="32"/>
+        </w:rPr>
+        <w:t>………………………</w:t>
       </w:r>
       <w:r>
         <w:rPr>
@@ -427,7 +451,7 @@
           <w:sz w:val="32"/>
           <w:szCs w:val="32"/>
         </w:rPr>
-        <w:t>5</w:t>
+        <w:t>6</w:t>
       </w:r>
     </w:p>
     <w:p>
@@ -450,15 +474,61 @@
           <w:sz w:val="32"/>
           <w:szCs w:val="32"/>
         </w:rPr>
-        <w:t>Final Takeaway………………………</w:t>
-      </w:r>
-      <w:r>
-        <w:rPr>
-          <w:rFonts w:cs="Calibri"/>
-          <w:sz w:val="32"/>
-          <w:szCs w:val="32"/>
-        </w:rPr>
-        <w:t>….</w:t>
+        <w:t>Null Aware Elements (</w:t>
+      </w:r>
+      <w:r>
+        <w:rPr>
+          <w:rFonts w:cs="Calibri"/>
+          <w:b/>
+          <w:bCs/>
+          <w:sz w:val="32"/>
+          <w:szCs w:val="32"/>
+        </w:rPr>
+        <w:t>?</w:t>
+      </w:r>
+      <w:r>
+        <w:rPr>
+          <w:rFonts w:cs="Calibri"/>
+          <w:sz w:val="32"/>
+          <w:szCs w:val="32"/>
+        </w:rPr>
+        <w:t xml:space="preserve">) in </w:t>
+      </w:r>
+      <w:r>
+        <w:rPr>
+          <w:rFonts w:cs="Calibri"/>
+          <w:b/>
+          <w:bCs/>
+          <w:sz w:val="32"/>
+          <w:szCs w:val="32"/>
+        </w:rPr>
+        <w:t>Column</w:t>
+      </w:r>
+      <w:r>
+        <w:rPr>
+          <w:rFonts w:cs="Calibri"/>
+          <w:sz w:val="32"/>
+          <w:szCs w:val="32"/>
+        </w:rPr>
+        <w:t>/</w:t>
+      </w:r>
+      <w:r>
+        <w:rPr>
+          <w:rFonts w:cs="Calibri"/>
+          <w:b/>
+          <w:bCs/>
+          <w:sz w:val="32"/>
+          <w:szCs w:val="32"/>
+        </w:rPr>
+        <w:t>Row</w:t>
+      </w:r>
+      <w:r>
+        <w:rPr>
+          <w:rFonts w:cs="Calibri"/>
+          <w:sz w:val="32"/>
+          <w:szCs w:val="32"/>
+        </w:rPr>
+        <w:t>…………</w:t>
       </w:r>
       <w:r>
         <w:rPr>
@@ -474,7 +544,7 @@
           <w:sz w:val="32"/>
           <w:szCs w:val="32"/>
         </w:rPr>
-        <w:t>………………………</w:t>
+        <w:t>..</w:t>
       </w:r>
       <w:r>
         <w:rPr>
@@ -513,8 +583,19 @@
           <w:sz w:val="32"/>
           <w:szCs w:val="32"/>
         </w:rPr>
-        <w:t>Null Aware Elements (</w:t>
-      </w:r>
+        <w:t>Null-Aware Spread Operator (</w:t>
+      </w:r>
+      <w:r>
+        <w:rPr>
+          <w:rFonts w:cs="Calibri"/>
+          <w:b/>
+          <w:bCs/>
+          <w:sz w:val="32"/>
+          <w:szCs w:val="32"/>
+        </w:rPr>
+        <w:t>…</w:t>
+      </w:r>
+      <w:proofErr w:type="gramStart"/>
       <w:r>
         <w:rPr>
           <w:rFonts w:cs="Calibri"/>
@@ -531,59 +612,40 @@
           <w:sz w:val="32"/>
           <w:szCs w:val="32"/>
         </w:rPr>
-        <w:t xml:space="preserve">) in </w:t>
-      </w:r>
-      <w:r>
-        <w:rPr>
-          <w:rFonts w:cs="Calibri"/>
-          <w:b/>
-          <w:bCs/>
-          <w:sz w:val="32"/>
-          <w:szCs w:val="32"/>
-        </w:rPr>
-        <w:t>Column</w:t>
-      </w:r>
-      <w:r>
-        <w:rPr>
-          <w:rFonts w:cs="Calibri"/>
-          <w:sz w:val="32"/>
-          <w:szCs w:val="32"/>
-        </w:rPr>
-        <w:t>/</w:t>
-      </w:r>
-      <w:r>
-        <w:rPr>
-          <w:rFonts w:cs="Calibri"/>
-          <w:b/>
-          <w:bCs/>
-          <w:sz w:val="32"/>
-          <w:szCs w:val="32"/>
-        </w:rPr>
-        <w:t>Row</w:t>
-      </w:r>
-      <w:r>
-        <w:rPr>
-          <w:rFonts w:cs="Calibri"/>
-          <w:sz w:val="32"/>
-          <w:szCs w:val="32"/>
-        </w:rPr>
-        <w:t>…………</w:t>
-      </w:r>
-      <w:r>
-        <w:rPr>
-          <w:rFonts w:cs="Calibri"/>
-          <w:sz w:val="32"/>
-          <w:szCs w:val="32"/>
-        </w:rPr>
-        <w:t>……………</w:t>
-      </w:r>
-      <w:r>
-        <w:rPr>
-          <w:rFonts w:cs="Calibri"/>
-          <w:sz w:val="32"/>
-          <w:szCs w:val="32"/>
-        </w:rPr>
-        <w:t>..</w:t>
+        <w:t>)…</w:t>
+      </w:r>
+      <w:proofErr w:type="gramEnd"/>
+      <w:r>
+        <w:rPr>
+          <w:rFonts w:cs="Calibri"/>
+          <w:sz w:val="32"/>
+          <w:szCs w:val="32"/>
+        </w:rPr>
+        <w:t>………………</w:t>
+      </w:r>
+      <w:r>
+        <w:rPr>
+          <w:rFonts w:cs="Calibri"/>
+          <w:sz w:val="32"/>
+          <w:szCs w:val="32"/>
+        </w:rPr>
+        <w:t>………</w:t>
+      </w:r>
+      <w:r>
+        <w:rPr>
+          <w:rFonts w:cs="Calibri"/>
+          <w:sz w:val="32"/>
+          <w:szCs w:val="32"/>
+        </w:rPr>
+        <w:t>….</w:t>
+      </w:r>
+      <w:r>
+        <w:rPr>
+          <w:rFonts w:cs="Calibri"/>
+          <w:sz w:val="32"/>
+          <w:szCs w:val="32"/>
+        </w:rPr>
+        <w:t>……</w:t>
       </w:r>
       <w:r>
         <w:rPr>
@@ -599,107 +661,6 @@
           <w:sz w:val="32"/>
           <w:szCs w:val="32"/>
         </w:rPr>
-        <w:t>6</w:t>
-      </w:r>
-    </w:p>
-    <w:p>
-      <w:pPr>
-        <w:pStyle w:val="ListParagraph"/>
-        <w:numPr>
-          <w:ilvl w:val="0"/>
-          <w:numId w:val="1"/>
-        </w:numPr>
-        <w:jc w:val="both"/>
-        <w:rPr>
-          <w:rFonts w:cs="Calibri"/>
-          <w:sz w:val="32"/>
-          <w:szCs w:val="32"/>
-        </w:rPr>
-      </w:pPr>
-      <w:r>
-        <w:rPr>
-          <w:rFonts w:cs="Calibri"/>
-          <w:sz w:val="32"/>
-          <w:szCs w:val="32"/>
-        </w:rPr>
-        <w:t>Null-Aware Spread Operator (</w:t>
-      </w:r>
-      <w:r>
-        <w:rPr>
-          <w:rFonts w:cs="Calibri"/>
-          <w:b/>
-          <w:bCs/>
-          <w:sz w:val="32"/>
-          <w:szCs w:val="32"/>
-        </w:rPr>
-        <w:t>…</w:t>
-      </w:r>
-      <w:proofErr w:type="gramStart"/>
-      <w:r>
-        <w:rPr>
-          <w:rFonts w:cs="Calibri"/>
-          <w:b/>
-          <w:bCs/>
-          <w:sz w:val="32"/>
-          <w:szCs w:val="32"/>
-        </w:rPr>
-        <w:t>?</w:t>
-      </w:r>
-      <w:r>
-        <w:rPr>
-          <w:rFonts w:cs="Calibri"/>
-          <w:sz w:val="32"/>
-          <w:szCs w:val="32"/>
-        </w:rPr>
-        <w:t>)…</w:t>
-      </w:r>
-      <w:proofErr w:type="gramEnd"/>
-      <w:r>
-        <w:rPr>
-          <w:rFonts w:cs="Calibri"/>
-          <w:sz w:val="32"/>
-          <w:szCs w:val="32"/>
-        </w:rPr>
-        <w:t>………………</w:t>
-      </w:r>
-      <w:r>
-        <w:rPr>
-          <w:rFonts w:cs="Calibri"/>
-          <w:sz w:val="32"/>
-          <w:szCs w:val="32"/>
-        </w:rPr>
-        <w:t>………</w:t>
-      </w:r>
-      <w:r>
-        <w:rPr>
-          <w:rFonts w:cs="Calibri"/>
-          <w:sz w:val="32"/>
-          <w:szCs w:val="32"/>
-        </w:rPr>
-        <w:t>….</w:t>
-      </w:r>
-      <w:r>
-        <w:rPr>
-          <w:rFonts w:cs="Calibri"/>
-          <w:sz w:val="32"/>
-          <w:szCs w:val="32"/>
-        </w:rPr>
-        <w:t>……</w:t>
-      </w:r>
-      <w:r>
-        <w:rPr>
-          <w:rFonts w:cs="Calibri"/>
-          <w:sz w:val="32"/>
-          <w:szCs w:val="32"/>
-        </w:rPr>
-        <w:t>.</w:t>
-      </w:r>
-      <w:r>
-        <w:rPr>
-          <w:rFonts w:cs="Calibri"/>
-          <w:sz w:val="32"/>
-          <w:szCs w:val="32"/>
-        </w:rPr>
         <w:t>9</w:t>
       </w:r>
     </w:p>
@@ -717,6 +678,24 @@
           <w:sz w:val="32"/>
           <w:szCs w:val="32"/>
         </w:rPr>
+        <w:br w:type="page"/>
+      </w:r>
+    </w:p>
+    <w:p>
+      <w:pPr>
+        <w:rPr>
+          <w:rFonts w:cs="Calibri"/>
+          <w:sz w:val="32"/>
+          <w:szCs w:val="32"/>
+        </w:rPr>
+      </w:pPr>
+      <w:r>
+        <w:rPr>
+          <w:rFonts w:cs="Calibri"/>
+          <w:sz w:val="32"/>
+          <w:szCs w:val="32"/>
+        </w:rPr>
+        <w:lastRenderedPageBreak/>
         <w:br w:type="page"/>
       </w:r>
     </w:p>
@@ -807,18 +786,14 @@
         <w:jc w:val="both"/>
         <w:rPr>
           <w:rFonts w:cs="Calibri"/>
-          <w:b/>
-          <w:bCs/>
-          <w:color w:val="D86DCB" w:themeColor="accent5" w:themeTint="99"/>
-          <w:sz w:val="32"/>
-          <w:szCs w:val="32"/>
-        </w:rPr>
-      </w:pPr>
-      <w:r>
-        <w:rPr>
-          <w:rFonts w:cs="Calibri"/>
-          <w:b/>
-          <w:bCs/>
+          <w:color w:val="D86DCB" w:themeColor="accent5" w:themeTint="99"/>
+          <w:sz w:val="32"/>
+          <w:szCs w:val="32"/>
+        </w:rPr>
+      </w:pPr>
+      <w:r>
+        <w:rPr>
+          <w:rFonts w:cs="Calibri"/>
           <w:color w:val="D86DCB" w:themeColor="accent5" w:themeTint="99"/>
           <w:sz w:val="32"/>
           <w:szCs w:val="32"/>
@@ -831,18 +806,14 @@
         <w:jc w:val="both"/>
         <w:rPr>
           <w:rFonts w:cs="Calibri"/>
-          <w:b/>
-          <w:bCs/>
-          <w:color w:val="D86DCB" w:themeColor="accent5" w:themeTint="99"/>
-          <w:sz w:val="32"/>
-          <w:szCs w:val="32"/>
-        </w:rPr>
-      </w:pPr>
-      <w:r>
-        <w:rPr>
-          <w:rFonts w:cs="Calibri"/>
-          <w:b/>
-          <w:bCs/>
+          <w:color w:val="D86DCB" w:themeColor="accent5" w:themeTint="99"/>
+          <w:sz w:val="32"/>
+          <w:szCs w:val="32"/>
+        </w:rPr>
+      </w:pPr>
+      <w:r>
+        <w:rPr>
+          <w:rFonts w:cs="Calibri"/>
           <w:color w:val="D86DCB" w:themeColor="accent5" w:themeTint="99"/>
           <w:sz w:val="32"/>
           <w:szCs w:val="32"/>
@@ -855,18 +826,14 @@
         <w:jc w:val="both"/>
         <w:rPr>
           <w:rFonts w:cs="Calibri"/>
-          <w:b/>
-          <w:bCs/>
-          <w:color w:val="D86DCB" w:themeColor="accent5" w:themeTint="99"/>
-          <w:sz w:val="32"/>
-          <w:szCs w:val="32"/>
-        </w:rPr>
-      </w:pPr>
-      <w:r>
-        <w:rPr>
-          <w:rFonts w:cs="Calibri"/>
-          <w:b/>
-          <w:bCs/>
+          <w:color w:val="D86DCB" w:themeColor="accent5" w:themeTint="99"/>
+          <w:sz w:val="32"/>
+          <w:szCs w:val="32"/>
+        </w:rPr>
+      </w:pPr>
+      <w:r>
+        <w:rPr>
+          <w:rFonts w:cs="Calibri"/>
           <w:color w:val="D86DCB" w:themeColor="accent5" w:themeTint="99"/>
           <w:sz w:val="32"/>
           <w:szCs w:val="32"/>
@@ -879,18 +846,14 @@
         <w:jc w:val="both"/>
         <w:rPr>
           <w:rFonts w:cs="Calibri"/>
-          <w:b/>
-          <w:bCs/>
-          <w:color w:val="D86DCB" w:themeColor="accent5" w:themeTint="99"/>
-          <w:sz w:val="32"/>
-          <w:szCs w:val="32"/>
-        </w:rPr>
-      </w:pPr>
-      <w:r>
-        <w:rPr>
-          <w:rFonts w:cs="Calibri"/>
-          <w:b/>
-          <w:bCs/>
+          <w:color w:val="D86DCB" w:themeColor="accent5" w:themeTint="99"/>
+          <w:sz w:val="32"/>
+          <w:szCs w:val="32"/>
+        </w:rPr>
+      </w:pPr>
+      <w:r>
+        <w:rPr>
+          <w:rFonts w:cs="Calibri"/>
           <w:color w:val="D86DCB" w:themeColor="accent5" w:themeTint="99"/>
           <w:sz w:val="32"/>
           <w:szCs w:val="32"/>
@@ -903,18 +866,14 @@
         <w:jc w:val="both"/>
         <w:rPr>
           <w:rFonts w:cs="Calibri"/>
-          <w:b/>
-          <w:bCs/>
-          <w:color w:val="D86DCB" w:themeColor="accent5" w:themeTint="99"/>
-          <w:sz w:val="32"/>
-          <w:szCs w:val="32"/>
-        </w:rPr>
-      </w:pPr>
-      <w:r>
-        <w:rPr>
-          <w:rFonts w:cs="Calibri"/>
-          <w:b/>
-          <w:bCs/>
+          <w:color w:val="D86DCB" w:themeColor="accent5" w:themeTint="99"/>
+          <w:sz w:val="32"/>
+          <w:szCs w:val="32"/>
+        </w:rPr>
+      </w:pPr>
+      <w:r>
+        <w:rPr>
+          <w:rFonts w:cs="Calibri"/>
           <w:color w:val="D86DCB" w:themeColor="accent5" w:themeTint="99"/>
           <w:sz w:val="32"/>
           <w:szCs w:val="32"/>
@@ -1525,18 +1484,14 @@
         <w:jc w:val="both"/>
         <w:rPr>
           <w:rFonts w:cs="Calibri"/>
-          <w:b/>
-          <w:bCs/>
-          <w:color w:val="D86DCB" w:themeColor="accent5" w:themeTint="99"/>
-          <w:sz w:val="32"/>
-          <w:szCs w:val="32"/>
-        </w:rPr>
-      </w:pPr>
-      <w:r>
-        <w:rPr>
-          <w:rFonts w:cs="Calibri"/>
-          <w:b/>
-          <w:bCs/>
+          <w:color w:val="D86DCB" w:themeColor="accent5" w:themeTint="99"/>
+          <w:sz w:val="32"/>
+          <w:szCs w:val="32"/>
+        </w:rPr>
+      </w:pPr>
+      <w:r>
+        <w:rPr>
+          <w:rFonts w:cs="Calibri"/>
           <w:color w:val="D86DCB" w:themeColor="accent5" w:themeTint="99"/>
           <w:sz w:val="32"/>
           <w:szCs w:val="32"/>
@@ -1547,8 +1502,6 @@
       <w:r>
         <w:rPr>
           <w:rFonts w:cs="Calibri"/>
-          <w:b/>
-          <w:bCs/>
           <w:color w:val="D86DCB" w:themeColor="accent5" w:themeTint="99"/>
           <w:sz w:val="32"/>
           <w:szCs w:val="32"/>
@@ -1559,8 +1512,6 @@
       <w:r>
         <w:rPr>
           <w:rFonts w:cs="Calibri"/>
-          <w:b/>
-          <w:bCs/>
           <w:color w:val="D86DCB" w:themeColor="accent5" w:themeTint="99"/>
           <w:sz w:val="32"/>
           <w:szCs w:val="32"/>
@@ -1573,18 +1524,14 @@
         <w:jc w:val="both"/>
         <w:rPr>
           <w:rFonts w:cs="Calibri"/>
-          <w:b/>
-          <w:bCs/>
-          <w:color w:val="D86DCB" w:themeColor="accent5" w:themeTint="99"/>
-          <w:sz w:val="32"/>
-          <w:szCs w:val="32"/>
-        </w:rPr>
-      </w:pPr>
-      <w:r>
-        <w:rPr>
-          <w:rFonts w:cs="Calibri"/>
-          <w:b/>
-          <w:bCs/>
+          <w:color w:val="D86DCB" w:themeColor="accent5" w:themeTint="99"/>
+          <w:sz w:val="32"/>
+          <w:szCs w:val="32"/>
+        </w:rPr>
+      </w:pPr>
+      <w:r>
+        <w:rPr>
+          <w:rFonts w:cs="Calibri"/>
           <w:color w:val="D86DCB" w:themeColor="accent5" w:themeTint="99"/>
           <w:sz w:val="32"/>
           <w:szCs w:val="32"/>
@@ -1597,18 +1544,14 @@
         <w:jc w:val="both"/>
         <w:rPr>
           <w:rFonts w:cs="Calibri"/>
-          <w:b/>
-          <w:bCs/>
-          <w:color w:val="D86DCB" w:themeColor="accent5" w:themeTint="99"/>
-          <w:sz w:val="32"/>
-          <w:szCs w:val="32"/>
-        </w:rPr>
-      </w:pPr>
-      <w:r>
-        <w:rPr>
-          <w:rFonts w:cs="Calibri"/>
-          <w:b/>
-          <w:bCs/>
+          <w:color w:val="D86DCB" w:themeColor="accent5" w:themeTint="99"/>
+          <w:sz w:val="32"/>
+          <w:szCs w:val="32"/>
+        </w:rPr>
+      </w:pPr>
+      <w:r>
+        <w:rPr>
+          <w:rFonts w:cs="Calibri"/>
           <w:color w:val="D86DCB" w:themeColor="accent5" w:themeTint="99"/>
           <w:sz w:val="32"/>
           <w:szCs w:val="32"/>
@@ -1619,8 +1562,6 @@
       <w:r>
         <w:rPr>
           <w:rFonts w:cs="Calibri"/>
-          <w:b/>
-          <w:bCs/>
           <w:color w:val="D86DCB" w:themeColor="accent5" w:themeTint="99"/>
           <w:sz w:val="32"/>
           <w:szCs w:val="32"/>
@@ -1631,8 +1572,6 @@
       <w:r>
         <w:rPr>
           <w:rFonts w:cs="Calibri"/>
-          <w:b/>
-          <w:bCs/>
           <w:color w:val="D86DCB" w:themeColor="accent5" w:themeTint="99"/>
           <w:sz w:val="32"/>
           <w:szCs w:val="32"/>
@@ -1645,18 +1584,14 @@
         <w:jc w:val="both"/>
         <w:rPr>
           <w:rFonts w:cs="Calibri"/>
-          <w:b/>
-          <w:bCs/>
-          <w:color w:val="D86DCB" w:themeColor="accent5" w:themeTint="99"/>
-          <w:sz w:val="32"/>
-          <w:szCs w:val="32"/>
-        </w:rPr>
-      </w:pPr>
-      <w:r>
-        <w:rPr>
-          <w:rFonts w:cs="Calibri"/>
-          <w:b/>
-          <w:bCs/>
+          <w:color w:val="D86DCB" w:themeColor="accent5" w:themeTint="99"/>
+          <w:sz w:val="32"/>
+          <w:szCs w:val="32"/>
+        </w:rPr>
+      </w:pPr>
+      <w:r>
+        <w:rPr>
+          <w:rFonts w:cs="Calibri"/>
           <w:color w:val="D86DCB" w:themeColor="accent5" w:themeTint="99"/>
           <w:sz w:val="32"/>
           <w:szCs w:val="32"/>
@@ -1855,18 +1790,14 @@
         <w:jc w:val="both"/>
         <w:rPr>
           <w:rFonts w:cs="Calibri"/>
-          <w:b/>
-          <w:bCs/>
-          <w:color w:val="D86DCB" w:themeColor="accent5" w:themeTint="99"/>
-          <w:sz w:val="32"/>
-          <w:szCs w:val="32"/>
-        </w:rPr>
-      </w:pPr>
-      <w:r>
-        <w:rPr>
-          <w:rFonts w:cs="Calibri"/>
-          <w:b/>
-          <w:bCs/>
+          <w:color w:val="D86DCB" w:themeColor="accent5" w:themeTint="99"/>
+          <w:sz w:val="32"/>
+          <w:szCs w:val="32"/>
+        </w:rPr>
+      </w:pPr>
+      <w:r>
+        <w:rPr>
+          <w:rFonts w:cs="Calibri"/>
           <w:color w:val="D86DCB" w:themeColor="accent5" w:themeTint="99"/>
           <w:sz w:val="32"/>
           <w:szCs w:val="32"/>
@@ -1877,8 +1808,6 @@
       <w:r>
         <w:rPr>
           <w:rFonts w:cs="Calibri"/>
-          <w:b/>
-          <w:bCs/>
           <w:color w:val="D86DCB" w:themeColor="accent5" w:themeTint="99"/>
           <w:sz w:val="32"/>
           <w:szCs w:val="32"/>
@@ -1889,8 +1818,6 @@
       <w:r>
         <w:rPr>
           <w:rFonts w:cs="Calibri"/>
-          <w:b/>
-          <w:bCs/>
           <w:color w:val="D86DCB" w:themeColor="accent5" w:themeTint="99"/>
           <w:sz w:val="32"/>
           <w:szCs w:val="32"/>
@@ -1903,18 +1830,14 @@
         <w:jc w:val="both"/>
         <w:rPr>
           <w:rFonts w:cs="Calibri"/>
-          <w:b/>
-          <w:bCs/>
-          <w:color w:val="D86DCB" w:themeColor="accent5" w:themeTint="99"/>
-          <w:sz w:val="32"/>
-          <w:szCs w:val="32"/>
-        </w:rPr>
-      </w:pPr>
-      <w:r>
-        <w:rPr>
-          <w:rFonts w:cs="Calibri"/>
-          <w:b/>
-          <w:bCs/>
+          <w:color w:val="D86DCB" w:themeColor="accent5" w:themeTint="99"/>
+          <w:sz w:val="32"/>
+          <w:szCs w:val="32"/>
+        </w:rPr>
+      </w:pPr>
+      <w:r>
+        <w:rPr>
+          <w:rFonts w:cs="Calibri"/>
           <w:color w:val="D86DCB" w:themeColor="accent5" w:themeTint="99"/>
           <w:sz w:val="32"/>
           <w:szCs w:val="32"/>
@@ -1927,18 +1850,14 @@
         <w:jc w:val="both"/>
         <w:rPr>
           <w:rFonts w:cs="Calibri"/>
-          <w:b/>
-          <w:bCs/>
-          <w:color w:val="D86DCB" w:themeColor="accent5" w:themeTint="99"/>
-          <w:sz w:val="32"/>
-          <w:szCs w:val="32"/>
-        </w:rPr>
-      </w:pPr>
-      <w:r>
-        <w:rPr>
-          <w:rFonts w:cs="Calibri"/>
-          <w:b/>
-          <w:bCs/>
+          <w:color w:val="D86DCB" w:themeColor="accent5" w:themeTint="99"/>
+          <w:sz w:val="32"/>
+          <w:szCs w:val="32"/>
+        </w:rPr>
+      </w:pPr>
+      <w:r>
+        <w:rPr>
+          <w:rFonts w:cs="Calibri"/>
           <w:color w:val="D86DCB" w:themeColor="accent5" w:themeTint="99"/>
           <w:sz w:val="32"/>
           <w:szCs w:val="32"/>
@@ -1951,18 +1870,14 @@
         <w:jc w:val="both"/>
         <w:rPr>
           <w:rFonts w:cs="Calibri"/>
-          <w:b/>
-          <w:bCs/>
-          <w:color w:val="D86DCB" w:themeColor="accent5" w:themeTint="99"/>
-          <w:sz w:val="32"/>
-          <w:szCs w:val="32"/>
-        </w:rPr>
-      </w:pPr>
-      <w:r>
-        <w:rPr>
-          <w:rFonts w:cs="Calibri"/>
-          <w:b/>
-          <w:bCs/>
+          <w:color w:val="D86DCB" w:themeColor="accent5" w:themeTint="99"/>
+          <w:sz w:val="32"/>
+          <w:szCs w:val="32"/>
+        </w:rPr>
+      </w:pPr>
+      <w:r>
+        <w:rPr>
+          <w:rFonts w:cs="Calibri"/>
           <w:color w:val="D86DCB" w:themeColor="accent5" w:themeTint="99"/>
           <w:sz w:val="32"/>
           <w:szCs w:val="32"/>
@@ -1975,18 +1890,14 @@
         <w:jc w:val="both"/>
         <w:rPr>
           <w:rFonts w:cs="Calibri"/>
-          <w:b/>
-          <w:bCs/>
-          <w:color w:val="D86DCB" w:themeColor="accent5" w:themeTint="99"/>
-          <w:sz w:val="32"/>
-          <w:szCs w:val="32"/>
-        </w:rPr>
-      </w:pPr>
-      <w:r>
-        <w:rPr>
-          <w:rFonts w:cs="Calibri"/>
-          <w:b/>
-          <w:bCs/>
+          <w:color w:val="D86DCB" w:themeColor="accent5" w:themeTint="99"/>
+          <w:sz w:val="32"/>
+          <w:szCs w:val="32"/>
+        </w:rPr>
+      </w:pPr>
+      <w:r>
+        <w:rPr>
+          <w:rFonts w:cs="Calibri"/>
           <w:color w:val="D86DCB" w:themeColor="accent5" w:themeTint="99"/>
           <w:sz w:val="32"/>
           <w:szCs w:val="32"/>
@@ -2129,18 +2040,14 @@
         <w:jc w:val="both"/>
         <w:rPr>
           <w:rFonts w:cs="Calibri"/>
-          <w:b/>
-          <w:bCs/>
-          <w:color w:val="D86DCB" w:themeColor="accent5" w:themeTint="99"/>
-          <w:sz w:val="32"/>
-          <w:szCs w:val="32"/>
-        </w:rPr>
-      </w:pPr>
-      <w:r>
-        <w:rPr>
-          <w:rFonts w:cs="Calibri"/>
-          <w:b/>
-          <w:bCs/>
+          <w:color w:val="D86DCB" w:themeColor="accent5" w:themeTint="99"/>
+          <w:sz w:val="32"/>
+          <w:szCs w:val="32"/>
+        </w:rPr>
+      </w:pPr>
+      <w:r>
+        <w:rPr>
+          <w:rFonts w:cs="Calibri"/>
           <w:color w:val="D86DCB" w:themeColor="accent5" w:themeTint="99"/>
           <w:sz w:val="32"/>
           <w:szCs w:val="32"/>
@@ -2152,8 +2059,6 @@
       <w:r>
         <w:rPr>
           <w:rFonts w:cs="Calibri"/>
-          <w:b/>
-          <w:bCs/>
           <w:color w:val="D86DCB" w:themeColor="accent5" w:themeTint="99"/>
           <w:sz w:val="32"/>
           <w:szCs w:val="32"/>
@@ -2164,8 +2069,6 @@
       <w:r>
         <w:rPr>
           <w:rFonts w:cs="Calibri"/>
-          <w:b/>
-          <w:bCs/>
           <w:color w:val="D86DCB" w:themeColor="accent5" w:themeTint="99"/>
           <w:sz w:val="32"/>
           <w:szCs w:val="32"/>
@@ -2175,8 +2078,6 @@
       <w:r>
         <w:rPr>
           <w:rFonts w:cs="Calibri"/>
-          <w:b/>
-          <w:bCs/>
           <w:color w:val="D86DCB" w:themeColor="accent5" w:themeTint="99"/>
           <w:sz w:val="32"/>
           <w:szCs w:val="32"/>
@@ -2186,8 +2087,6 @@
       <w:r>
         <w:rPr>
           <w:rFonts w:cs="Calibri"/>
-          <w:b/>
-          <w:bCs/>
           <w:color w:val="D86DCB" w:themeColor="accent5" w:themeTint="99"/>
           <w:sz w:val="32"/>
           <w:szCs w:val="32"/>
@@ -2200,18 +2099,14 @@
         <w:jc w:val="both"/>
         <w:rPr>
           <w:rFonts w:cs="Calibri"/>
-          <w:b/>
-          <w:bCs/>
-          <w:color w:val="D86DCB" w:themeColor="accent5" w:themeTint="99"/>
-          <w:sz w:val="32"/>
-          <w:szCs w:val="32"/>
-        </w:rPr>
-      </w:pPr>
-      <w:r>
-        <w:rPr>
-          <w:rFonts w:cs="Calibri"/>
-          <w:b/>
-          <w:bCs/>
+          <w:color w:val="D86DCB" w:themeColor="accent5" w:themeTint="99"/>
+          <w:sz w:val="32"/>
+          <w:szCs w:val="32"/>
+        </w:rPr>
+      </w:pPr>
+      <w:r>
+        <w:rPr>
+          <w:rFonts w:cs="Calibri"/>
           <w:color w:val="D86DCB" w:themeColor="accent5" w:themeTint="99"/>
           <w:sz w:val="32"/>
           <w:szCs w:val="32"/>
@@ -2222,8 +2117,6 @@
       <w:r>
         <w:rPr>
           <w:rFonts w:cs="Calibri"/>
-          <w:b/>
-          <w:bCs/>
           <w:color w:val="D86DCB" w:themeColor="accent5" w:themeTint="99"/>
           <w:sz w:val="32"/>
           <w:szCs w:val="32"/>
@@ -2234,8 +2127,6 @@
       <w:r>
         <w:rPr>
           <w:rFonts w:cs="Calibri"/>
-          <w:b/>
-          <w:bCs/>
           <w:color w:val="D86DCB" w:themeColor="accent5" w:themeTint="99"/>
           <w:sz w:val="32"/>
           <w:szCs w:val="32"/>
@@ -2248,18 +2139,14 @@
         <w:jc w:val="both"/>
         <w:rPr>
           <w:rFonts w:cs="Calibri"/>
-          <w:b/>
-          <w:bCs/>
-          <w:color w:val="D86DCB" w:themeColor="accent5" w:themeTint="99"/>
-          <w:sz w:val="32"/>
-          <w:szCs w:val="32"/>
-        </w:rPr>
-      </w:pPr>
-      <w:r>
-        <w:rPr>
-          <w:rFonts w:cs="Calibri"/>
-          <w:b/>
-          <w:bCs/>
+          <w:color w:val="D86DCB" w:themeColor="accent5" w:themeTint="99"/>
+          <w:sz w:val="32"/>
+          <w:szCs w:val="32"/>
+        </w:rPr>
+      </w:pPr>
+      <w:r>
+        <w:rPr>
+          <w:rFonts w:cs="Calibri"/>
           <w:color w:val="D86DCB" w:themeColor="accent5" w:themeTint="99"/>
           <w:sz w:val="32"/>
           <w:szCs w:val="32"/>
@@ -2322,8 +2209,6 @@
         <w:jc w:val="both"/>
         <w:rPr>
           <w:rFonts w:cs="Calibri"/>
-          <w:b/>
-          <w:bCs/>
           <w:color w:val="D86DCB" w:themeColor="accent5" w:themeTint="99"/>
           <w:sz w:val="32"/>
           <w:szCs w:val="32"/>
@@ -2333,8 +2218,6 @@
       <w:r>
         <w:rPr>
           <w:rFonts w:cs="Calibri"/>
-          <w:b/>
-          <w:bCs/>
           <w:color w:val="D86DCB" w:themeColor="accent5" w:themeTint="99"/>
           <w:sz w:val="32"/>
           <w:szCs w:val="32"/>
@@ -2345,8 +2228,6 @@
       <w:r>
         <w:rPr>
           <w:rFonts w:cs="Calibri"/>
-          <w:b/>
-          <w:bCs/>
           <w:color w:val="D86DCB" w:themeColor="accent5" w:themeTint="99"/>
           <w:sz w:val="32"/>
           <w:szCs w:val="32"/>
@@ -2619,18 +2500,14 @@
         <w:jc w:val="both"/>
         <w:rPr>
           <w:rFonts w:cs="Calibri"/>
-          <w:b/>
-          <w:bCs/>
-          <w:color w:val="D86DCB" w:themeColor="accent5" w:themeTint="99"/>
-          <w:sz w:val="32"/>
-          <w:szCs w:val="32"/>
-        </w:rPr>
-      </w:pPr>
-      <w:r>
-        <w:rPr>
-          <w:rFonts w:cs="Calibri"/>
-          <w:b/>
-          <w:bCs/>
+          <w:color w:val="D86DCB" w:themeColor="accent5" w:themeTint="99"/>
+          <w:sz w:val="32"/>
+          <w:szCs w:val="32"/>
+        </w:rPr>
+      </w:pPr>
+      <w:r>
+        <w:rPr>
+          <w:rFonts w:cs="Calibri"/>
           <w:color w:val="D86DCB" w:themeColor="accent5" w:themeTint="99"/>
           <w:sz w:val="32"/>
           <w:szCs w:val="32"/>
@@ -2641,8 +2518,6 @@
       <w:r>
         <w:rPr>
           <w:rFonts w:cs="Calibri"/>
-          <w:b/>
-          <w:bCs/>
           <w:color w:val="D86DCB" w:themeColor="accent5" w:themeTint="99"/>
           <w:sz w:val="32"/>
           <w:szCs w:val="32"/>
@@ -2653,8 +2528,6 @@
       <w:r>
         <w:rPr>
           <w:rFonts w:cs="Calibri"/>
-          <w:b/>
-          <w:bCs/>
           <w:color w:val="D86DCB" w:themeColor="accent5" w:themeTint="99"/>
           <w:sz w:val="32"/>
           <w:szCs w:val="32"/>
@@ -2667,18 +2540,14 @@
         <w:jc w:val="both"/>
         <w:rPr>
           <w:rFonts w:cs="Calibri"/>
-          <w:b/>
-          <w:bCs/>
-          <w:color w:val="D86DCB" w:themeColor="accent5" w:themeTint="99"/>
-          <w:sz w:val="32"/>
-          <w:szCs w:val="32"/>
-        </w:rPr>
-      </w:pPr>
-      <w:r>
-        <w:rPr>
-          <w:rFonts w:cs="Calibri"/>
-          <w:b/>
-          <w:bCs/>
+          <w:color w:val="D86DCB" w:themeColor="accent5" w:themeTint="99"/>
+          <w:sz w:val="32"/>
+          <w:szCs w:val="32"/>
+        </w:rPr>
+      </w:pPr>
+      <w:r>
+        <w:rPr>
+          <w:rFonts w:cs="Calibri"/>
           <w:color w:val="D86DCB" w:themeColor="accent5" w:themeTint="99"/>
           <w:sz w:val="32"/>
           <w:szCs w:val="32"/>
@@ -2691,18 +2560,14 @@
         <w:jc w:val="both"/>
         <w:rPr>
           <w:rFonts w:cs="Calibri"/>
-          <w:b/>
-          <w:bCs/>
-          <w:color w:val="D86DCB" w:themeColor="accent5" w:themeTint="99"/>
-          <w:sz w:val="32"/>
-          <w:szCs w:val="32"/>
-        </w:rPr>
-      </w:pPr>
-      <w:r>
-        <w:rPr>
-          <w:rFonts w:cs="Calibri"/>
-          <w:b/>
-          <w:bCs/>
+          <w:color w:val="D86DCB" w:themeColor="accent5" w:themeTint="99"/>
+          <w:sz w:val="32"/>
+          <w:szCs w:val="32"/>
+        </w:rPr>
+      </w:pPr>
+      <w:r>
+        <w:rPr>
+          <w:rFonts w:cs="Calibri"/>
           <w:color w:val="D86DCB" w:themeColor="accent5" w:themeTint="99"/>
           <w:sz w:val="32"/>
           <w:szCs w:val="32"/>
@@ -2715,18 +2580,14 @@
         <w:jc w:val="both"/>
         <w:rPr>
           <w:rFonts w:cs="Calibri"/>
-          <w:b/>
-          <w:bCs/>
-          <w:color w:val="D86DCB" w:themeColor="accent5" w:themeTint="99"/>
-          <w:sz w:val="32"/>
-          <w:szCs w:val="32"/>
-        </w:rPr>
-      </w:pPr>
-      <w:r>
-        <w:rPr>
-          <w:rFonts w:cs="Calibri"/>
-          <w:b/>
-          <w:bCs/>
+          <w:color w:val="D86DCB" w:themeColor="accent5" w:themeTint="99"/>
+          <w:sz w:val="32"/>
+          <w:szCs w:val="32"/>
+        </w:rPr>
+      </w:pPr>
+      <w:r>
+        <w:rPr>
+          <w:rFonts w:cs="Calibri"/>
           <w:color w:val="D86DCB" w:themeColor="accent5" w:themeTint="99"/>
           <w:sz w:val="32"/>
           <w:szCs w:val="32"/>
@@ -2737,8 +2598,6 @@
       <w:r>
         <w:rPr>
           <w:rFonts w:cs="Calibri"/>
-          <w:b/>
-          <w:bCs/>
           <w:color w:val="D86DCB" w:themeColor="accent5" w:themeTint="99"/>
           <w:sz w:val="32"/>
           <w:szCs w:val="32"/>
@@ -2749,8 +2608,6 @@
       <w:r>
         <w:rPr>
           <w:rFonts w:cs="Calibri"/>
-          <w:b/>
-          <w:bCs/>
           <w:color w:val="D86DCB" w:themeColor="accent5" w:themeTint="99"/>
           <w:sz w:val="32"/>
           <w:szCs w:val="32"/>
@@ -2761,8 +2618,6 @@
       <w:r>
         <w:rPr>
           <w:rFonts w:cs="Calibri"/>
-          <w:b/>
-          <w:bCs/>
           <w:color w:val="D86DCB" w:themeColor="accent5" w:themeTint="99"/>
           <w:sz w:val="32"/>
           <w:szCs w:val="32"/>
@@ -2776,18 +2631,14 @@
         <w:jc w:val="both"/>
         <w:rPr>
           <w:rFonts w:cs="Calibri"/>
-          <w:b/>
-          <w:bCs/>
-          <w:color w:val="D86DCB" w:themeColor="accent5" w:themeTint="99"/>
-          <w:sz w:val="32"/>
-          <w:szCs w:val="32"/>
-        </w:rPr>
-      </w:pPr>
-      <w:r>
-        <w:rPr>
-          <w:rFonts w:cs="Calibri"/>
-          <w:b/>
-          <w:bCs/>
+          <w:color w:val="D86DCB" w:themeColor="accent5" w:themeTint="99"/>
+          <w:sz w:val="32"/>
+          <w:szCs w:val="32"/>
+        </w:rPr>
+      </w:pPr>
+      <w:r>
+        <w:rPr>
+          <w:rFonts w:cs="Calibri"/>
           <w:color w:val="D86DCB" w:themeColor="accent5" w:themeTint="99"/>
           <w:sz w:val="32"/>
           <w:szCs w:val="32"/>
@@ -2798,8 +2649,6 @@
       <w:r>
         <w:rPr>
           <w:rFonts w:cs="Calibri"/>
-          <w:b/>
-          <w:bCs/>
           <w:color w:val="D86DCB" w:themeColor="accent5" w:themeTint="99"/>
           <w:sz w:val="32"/>
           <w:szCs w:val="32"/>
@@ -2810,8 +2659,6 @@
       <w:r>
         <w:rPr>
           <w:rFonts w:cs="Calibri"/>
-          <w:b/>
-          <w:bCs/>
           <w:color w:val="D86DCB" w:themeColor="accent5" w:themeTint="99"/>
           <w:sz w:val="32"/>
           <w:szCs w:val="32"/>
@@ -2824,18 +2671,14 @@
         <w:jc w:val="both"/>
         <w:rPr>
           <w:rFonts w:cs="Calibri"/>
-          <w:b/>
-          <w:bCs/>
-          <w:color w:val="D86DCB" w:themeColor="accent5" w:themeTint="99"/>
-          <w:sz w:val="32"/>
-          <w:szCs w:val="32"/>
-        </w:rPr>
-      </w:pPr>
-      <w:r>
-        <w:rPr>
-          <w:rFonts w:cs="Calibri"/>
-          <w:b/>
-          <w:bCs/>
+          <w:color w:val="D86DCB" w:themeColor="accent5" w:themeTint="99"/>
+          <w:sz w:val="32"/>
+          <w:szCs w:val="32"/>
+        </w:rPr>
+      </w:pPr>
+      <w:r>
+        <w:rPr>
+          <w:rFonts w:cs="Calibri"/>
           <w:color w:val="D86DCB" w:themeColor="accent5" w:themeTint="99"/>
           <w:sz w:val="32"/>
           <w:szCs w:val="32"/>
@@ -3080,18 +2923,14 @@
         <w:jc w:val="both"/>
         <w:rPr>
           <w:rFonts w:cs="Calibri"/>
-          <w:b/>
-          <w:bCs/>
-          <w:color w:val="D86DCB" w:themeColor="accent5" w:themeTint="99"/>
-          <w:sz w:val="32"/>
-          <w:szCs w:val="32"/>
-        </w:rPr>
-      </w:pPr>
-      <w:r>
-        <w:rPr>
-          <w:rFonts w:cs="Calibri"/>
-          <w:b/>
-          <w:bCs/>
+          <w:color w:val="D86DCB" w:themeColor="accent5" w:themeTint="99"/>
+          <w:sz w:val="32"/>
+          <w:szCs w:val="32"/>
+        </w:rPr>
+      </w:pPr>
+      <w:r>
+        <w:rPr>
+          <w:rFonts w:cs="Calibri"/>
           <w:color w:val="D86DCB" w:themeColor="accent5" w:themeTint="99"/>
           <w:sz w:val="32"/>
           <w:szCs w:val="32"/>
@@ -3104,18 +2943,14 @@
         <w:jc w:val="both"/>
         <w:rPr>
           <w:rFonts w:cs="Calibri"/>
-          <w:b/>
-          <w:bCs/>
-          <w:color w:val="D86DCB" w:themeColor="accent5" w:themeTint="99"/>
-          <w:sz w:val="32"/>
-          <w:szCs w:val="32"/>
-        </w:rPr>
-      </w:pPr>
-      <w:r>
-        <w:rPr>
-          <w:rFonts w:cs="Calibri"/>
-          <w:b/>
-          <w:bCs/>
+          <w:color w:val="D86DCB" w:themeColor="accent5" w:themeTint="99"/>
+          <w:sz w:val="32"/>
+          <w:szCs w:val="32"/>
+        </w:rPr>
+      </w:pPr>
+      <w:r>
+        <w:rPr>
+          <w:rFonts w:cs="Calibri"/>
           <w:color w:val="D86DCB" w:themeColor="accent5" w:themeTint="99"/>
           <w:sz w:val="32"/>
           <w:szCs w:val="32"/>
@@ -3128,18 +2963,14 @@
         <w:jc w:val="both"/>
         <w:rPr>
           <w:rFonts w:cs="Calibri"/>
-          <w:b/>
-          <w:bCs/>
-          <w:color w:val="D86DCB" w:themeColor="accent5" w:themeTint="99"/>
-          <w:sz w:val="32"/>
-          <w:szCs w:val="32"/>
-        </w:rPr>
-      </w:pPr>
-      <w:r>
-        <w:rPr>
-          <w:rFonts w:cs="Calibri"/>
-          <w:b/>
-          <w:bCs/>
+          <w:color w:val="D86DCB" w:themeColor="accent5" w:themeTint="99"/>
+          <w:sz w:val="32"/>
+          <w:szCs w:val="32"/>
+        </w:rPr>
+      </w:pPr>
+      <w:r>
+        <w:rPr>
+          <w:rFonts w:cs="Calibri"/>
           <w:color w:val="D86DCB" w:themeColor="accent5" w:themeTint="99"/>
           <w:sz w:val="32"/>
           <w:szCs w:val="32"/>
@@ -3152,31 +2983,25 @@
         <w:jc w:val="both"/>
         <w:rPr>
           <w:rFonts w:cs="Calibri"/>
-          <w:b/>
-          <w:bCs/>
-          <w:color w:val="D86DCB" w:themeColor="accent5" w:themeTint="99"/>
-          <w:sz w:val="32"/>
-          <w:szCs w:val="32"/>
-        </w:rPr>
-      </w:pPr>
-    </w:p>
-    <w:p>
-      <w:pPr>
-        <w:jc w:val="both"/>
-        <w:rPr>
-          <w:rFonts w:cs="Calibri"/>
-          <w:b/>
-          <w:bCs/>
-          <w:color w:val="D86DCB" w:themeColor="accent5" w:themeTint="99"/>
-          <w:sz w:val="32"/>
-          <w:szCs w:val="32"/>
-        </w:rPr>
-      </w:pPr>
-      <w:r>
-        <w:rPr>
-          <w:rFonts w:cs="Calibri"/>
-          <w:b/>
-          <w:bCs/>
+          <w:color w:val="D86DCB" w:themeColor="accent5" w:themeTint="99"/>
+          <w:sz w:val="32"/>
+          <w:szCs w:val="32"/>
+        </w:rPr>
+      </w:pPr>
+    </w:p>
+    <w:p>
+      <w:pPr>
+        <w:jc w:val="both"/>
+        <w:rPr>
+          <w:rFonts w:cs="Calibri"/>
+          <w:color w:val="D86DCB" w:themeColor="accent5" w:themeTint="99"/>
+          <w:sz w:val="32"/>
+          <w:szCs w:val="32"/>
+        </w:rPr>
+      </w:pPr>
+      <w:r>
+        <w:rPr>
+          <w:rFonts w:cs="Calibri"/>
           <w:color w:val="D86DCB" w:themeColor="accent5" w:themeTint="99"/>
           <w:sz w:val="32"/>
           <w:szCs w:val="32"/>
@@ -3187,8 +3012,6 @@
       <w:r>
         <w:rPr>
           <w:rFonts w:cs="Calibri"/>
-          <w:b/>
-          <w:bCs/>
           <w:color w:val="D86DCB" w:themeColor="accent5" w:themeTint="99"/>
           <w:sz w:val="32"/>
           <w:szCs w:val="32"/>
@@ -3198,8 +3021,6 @@
       <w:r>
         <w:rPr>
           <w:rFonts w:cs="Calibri"/>
-          <w:b/>
-          <w:bCs/>
           <w:color w:val="D86DCB" w:themeColor="accent5" w:themeTint="99"/>
           <w:sz w:val="32"/>
           <w:szCs w:val="32"/>
@@ -3209,8 +3030,6 @@
       <w:r>
         <w:rPr>
           <w:rFonts w:cs="Calibri"/>
-          <w:b/>
-          <w:bCs/>
           <w:color w:val="D86DCB" w:themeColor="accent5" w:themeTint="99"/>
           <w:sz w:val="32"/>
           <w:szCs w:val="32"/>
@@ -3221,8 +3040,6 @@
       <w:r>
         <w:rPr>
           <w:rFonts w:cs="Calibri"/>
-          <w:b/>
-          <w:bCs/>
           <w:color w:val="D86DCB" w:themeColor="accent5" w:themeTint="99"/>
           <w:sz w:val="32"/>
           <w:szCs w:val="32"/>
@@ -3345,18 +3162,14 @@
         <w:jc w:val="both"/>
         <w:rPr>
           <w:rFonts w:cs="Calibri"/>
-          <w:b/>
-          <w:bCs/>
-          <w:color w:val="D86DCB" w:themeColor="accent5" w:themeTint="99"/>
-          <w:sz w:val="32"/>
-          <w:szCs w:val="32"/>
-        </w:rPr>
-      </w:pPr>
-      <w:r>
-        <w:rPr>
-          <w:rFonts w:cs="Calibri"/>
-          <w:b/>
-          <w:bCs/>
+          <w:color w:val="D86DCB" w:themeColor="accent5" w:themeTint="99"/>
+          <w:sz w:val="32"/>
+          <w:szCs w:val="32"/>
+        </w:rPr>
+      </w:pPr>
+      <w:r>
+        <w:rPr>
+          <w:rFonts w:cs="Calibri"/>
           <w:color w:val="D86DCB" w:themeColor="accent5" w:themeTint="99"/>
           <w:sz w:val="32"/>
           <w:szCs w:val="32"/>
@@ -3369,18 +3182,14 @@
         <w:jc w:val="both"/>
         <w:rPr>
           <w:rFonts w:cs="Calibri"/>
-          <w:b/>
-          <w:bCs/>
-          <w:color w:val="D86DCB" w:themeColor="accent5" w:themeTint="99"/>
-          <w:sz w:val="32"/>
-          <w:szCs w:val="32"/>
-        </w:rPr>
-      </w:pPr>
-      <w:r>
-        <w:rPr>
-          <w:rFonts w:cs="Calibri"/>
-          <w:b/>
-          <w:bCs/>
+          <w:color w:val="D86DCB" w:themeColor="accent5" w:themeTint="99"/>
+          <w:sz w:val="32"/>
+          <w:szCs w:val="32"/>
+        </w:rPr>
+      </w:pPr>
+      <w:r>
+        <w:rPr>
+          <w:rFonts w:cs="Calibri"/>
           <w:color w:val="D86DCB" w:themeColor="accent5" w:themeTint="99"/>
           <w:sz w:val="32"/>
           <w:szCs w:val="32"/>
@@ -3391,8 +3200,6 @@
       <w:r>
         <w:rPr>
           <w:rFonts w:cs="Calibri"/>
-          <w:b/>
-          <w:bCs/>
           <w:color w:val="D86DCB" w:themeColor="accent5" w:themeTint="99"/>
           <w:sz w:val="32"/>
           <w:szCs w:val="32"/>
@@ -3403,8 +3210,6 @@
       <w:r>
         <w:rPr>
           <w:rFonts w:cs="Calibri"/>
-          <w:b/>
-          <w:bCs/>
           <w:color w:val="D86DCB" w:themeColor="accent5" w:themeTint="99"/>
           <w:sz w:val="32"/>
           <w:szCs w:val="32"/>
@@ -3501,18 +3306,14 @@
         <w:jc w:val="both"/>
         <w:rPr>
           <w:rFonts w:cs="Calibri"/>
-          <w:b/>
-          <w:bCs/>
-          <w:color w:val="D86DCB" w:themeColor="accent5" w:themeTint="99"/>
-          <w:sz w:val="32"/>
-          <w:szCs w:val="32"/>
-        </w:rPr>
-      </w:pPr>
-      <w:r>
-        <w:rPr>
-          <w:rFonts w:cs="Calibri"/>
-          <w:b/>
-          <w:bCs/>
+          <w:color w:val="D86DCB" w:themeColor="accent5" w:themeTint="99"/>
+          <w:sz w:val="32"/>
+          <w:szCs w:val="32"/>
+        </w:rPr>
+      </w:pPr>
+      <w:r>
+        <w:rPr>
+          <w:rFonts w:cs="Calibri"/>
           <w:color w:val="D86DCB" w:themeColor="accent5" w:themeTint="99"/>
           <w:sz w:val="32"/>
           <w:szCs w:val="32"/>
@@ -3525,18 +3326,14 @@
         <w:jc w:val="both"/>
         <w:rPr>
           <w:rFonts w:cs="Calibri"/>
-          <w:b/>
-          <w:bCs/>
-          <w:color w:val="D86DCB" w:themeColor="accent5" w:themeTint="99"/>
-          <w:sz w:val="32"/>
-          <w:szCs w:val="32"/>
-        </w:rPr>
-      </w:pPr>
-      <w:r>
-        <w:rPr>
-          <w:rFonts w:cs="Calibri"/>
-          <w:b/>
-          <w:bCs/>
+          <w:color w:val="D86DCB" w:themeColor="accent5" w:themeTint="99"/>
+          <w:sz w:val="32"/>
+          <w:szCs w:val="32"/>
+        </w:rPr>
+      </w:pPr>
+      <w:r>
+        <w:rPr>
+          <w:rFonts w:cs="Calibri"/>
           <w:color w:val="D86DCB" w:themeColor="accent5" w:themeTint="99"/>
           <w:sz w:val="32"/>
           <w:szCs w:val="32"/>
@@ -3547,8 +3344,6 @@
       <w:r>
         <w:rPr>
           <w:rFonts w:cs="Calibri"/>
-          <w:b/>
-          <w:bCs/>
           <w:color w:val="D86DCB" w:themeColor="accent5" w:themeTint="99"/>
           <w:sz w:val="32"/>
           <w:szCs w:val="32"/>
@@ -3559,8 +3354,6 @@
       <w:r>
         <w:rPr>
           <w:rFonts w:cs="Calibri"/>
-          <w:b/>
-          <w:bCs/>
           <w:color w:val="D86DCB" w:themeColor="accent5" w:themeTint="99"/>
           <w:sz w:val="32"/>
           <w:szCs w:val="32"/>
@@ -3573,18 +3366,14 @@
         <w:jc w:val="both"/>
         <w:rPr>
           <w:rFonts w:cs="Calibri"/>
-          <w:b/>
-          <w:bCs/>
-          <w:color w:val="D86DCB" w:themeColor="accent5" w:themeTint="99"/>
-          <w:sz w:val="32"/>
-          <w:szCs w:val="32"/>
-        </w:rPr>
-      </w:pPr>
-      <w:r>
-        <w:rPr>
-          <w:rFonts w:cs="Calibri"/>
-          <w:b/>
-          <w:bCs/>
+          <w:color w:val="D86DCB" w:themeColor="accent5" w:themeTint="99"/>
+          <w:sz w:val="32"/>
+          <w:szCs w:val="32"/>
+        </w:rPr>
+      </w:pPr>
+      <w:r>
+        <w:rPr>
+          <w:rFonts w:cs="Calibri"/>
           <w:color w:val="D86DCB" w:themeColor="accent5" w:themeTint="99"/>
           <w:sz w:val="32"/>
           <w:szCs w:val="32"/>
@@ -3597,18 +3386,14 @@
         <w:jc w:val="both"/>
         <w:rPr>
           <w:rFonts w:cs="Calibri"/>
-          <w:b/>
-          <w:bCs/>
-          <w:color w:val="D86DCB" w:themeColor="accent5" w:themeTint="99"/>
-          <w:sz w:val="32"/>
-          <w:szCs w:val="32"/>
-        </w:rPr>
-      </w:pPr>
-      <w:r>
-        <w:rPr>
-          <w:rFonts w:cs="Calibri"/>
-          <w:b/>
-          <w:bCs/>
+          <w:color w:val="D86DCB" w:themeColor="accent5" w:themeTint="99"/>
+          <w:sz w:val="32"/>
+          <w:szCs w:val="32"/>
+        </w:rPr>
+      </w:pPr>
+      <w:r>
+        <w:rPr>
+          <w:rFonts w:cs="Calibri"/>
           <w:color w:val="D86DCB" w:themeColor="accent5" w:themeTint="99"/>
           <w:sz w:val="32"/>
           <w:szCs w:val="32"/>
@@ -3621,18 +3406,14 @@
         <w:jc w:val="both"/>
         <w:rPr>
           <w:rFonts w:cs="Calibri"/>
-          <w:b/>
-          <w:bCs/>
-          <w:color w:val="D86DCB" w:themeColor="accent5" w:themeTint="99"/>
-          <w:sz w:val="32"/>
-          <w:szCs w:val="32"/>
-        </w:rPr>
-      </w:pPr>
-      <w:r>
-        <w:rPr>
-          <w:rFonts w:cs="Calibri"/>
-          <w:b/>
-          <w:bCs/>
+          <w:color w:val="D86DCB" w:themeColor="accent5" w:themeTint="99"/>
+          <w:sz w:val="32"/>
+          <w:szCs w:val="32"/>
+        </w:rPr>
+      </w:pPr>
+      <w:r>
+        <w:rPr>
+          <w:rFonts w:cs="Calibri"/>
           <w:color w:val="D86DCB" w:themeColor="accent5" w:themeTint="99"/>
           <w:sz w:val="32"/>
           <w:szCs w:val="32"/>
@@ -3712,18 +3493,36 @@
         </w:rPr>
         <w:t xml:space="preserve">Final </w:t>
       </w:r>
-      <w:proofErr w:type="spellStart"/>
-      <w:r>
-        <w:rPr>
-          <w:rFonts w:cs="Calibri"/>
-          <w:b/>
-          <w:bCs/>
-          <w:sz w:val="32"/>
-          <w:szCs w:val="32"/>
-        </w:rPr>
-        <w:t>Takeway</w:t>
-      </w:r>
-      <w:proofErr w:type="spellEnd"/>
+      <w:r>
+        <w:rPr>
+          <w:rFonts w:cs="Calibri"/>
+          <w:b/>
+          <w:bCs/>
+          <w:sz w:val="32"/>
+          <w:szCs w:val="32"/>
+        </w:rPr>
+        <w:t xml:space="preserve">Take </w:t>
+      </w:r>
+      <w:r>
+        <w:rPr>
+          <w:rFonts w:cs="Calibri"/>
+          <w:b/>
+          <w:bCs/>
+          <w:sz w:val="32"/>
+          <w:szCs w:val="32"/>
+        </w:rPr>
+        <w:t>A</w:t>
+      </w:r>
+      <w:r>
+        <w:rPr>
+          <w:rFonts w:cs="Calibri"/>
+          <w:b/>
+          <w:bCs/>
+          <w:sz w:val="32"/>
+          <w:szCs w:val="32"/>
+        </w:rPr>
+        <w:t>way</w:t>
+      </w:r>
       <w:r>
         <w:rPr>
           <w:rFonts w:cs="Calibri"/>
@@ -4086,30 +3885,6 @@
           <w:szCs w:val="32"/>
         </w:rPr>
       </w:pPr>
-    </w:p>
-    <w:p>
-      <w:pPr>
-        <w:jc w:val="both"/>
-        <w:rPr>
-          <w:rFonts w:cs="Calibri"/>
-          <w:b/>
-          <w:bCs/>
-          <w:sz w:val="32"/>
-          <w:szCs w:val="32"/>
-        </w:rPr>
-      </w:pPr>
-    </w:p>
-    <w:p>
-      <w:pPr>
-        <w:jc w:val="both"/>
-        <w:rPr>
-          <w:rFonts w:cs="Calibri"/>
-          <w:b/>
-          <w:bCs/>
-          <w:sz w:val="32"/>
-          <w:szCs w:val="32"/>
-        </w:rPr>
-      </w:pPr>
       <w:r>
         <w:rPr>
           <w:rFonts w:cs="Calibri"/>
@@ -4396,8 +4171,6 @@
         <w:jc w:val="both"/>
         <w:rPr>
           <w:rFonts w:cs="Calibri"/>
-          <w:b/>
-          <w:bCs/>
           <w:color w:val="D86DCB" w:themeColor="accent5" w:themeTint="99"/>
           <w:sz w:val="32"/>
           <w:szCs w:val="32"/>
@@ -4407,8 +4180,6 @@
       <w:r>
         <w:rPr>
           <w:rFonts w:cs="Calibri"/>
-          <w:b/>
-          <w:bCs/>
           <w:color w:val="D86DCB" w:themeColor="accent5" w:themeTint="99"/>
           <w:sz w:val="32"/>
           <w:szCs w:val="32"/>
@@ -4422,18 +4193,14 @@
         <w:jc w:val="both"/>
         <w:rPr>
           <w:rFonts w:cs="Calibri"/>
-          <w:b/>
-          <w:bCs/>
-          <w:color w:val="D86DCB" w:themeColor="accent5" w:themeTint="99"/>
-          <w:sz w:val="32"/>
-          <w:szCs w:val="32"/>
-        </w:rPr>
-      </w:pPr>
-      <w:r>
-        <w:rPr>
-          <w:rFonts w:cs="Calibri"/>
-          <w:b/>
-          <w:bCs/>
+          <w:color w:val="D86DCB" w:themeColor="accent5" w:themeTint="99"/>
+          <w:sz w:val="32"/>
+          <w:szCs w:val="32"/>
+        </w:rPr>
+      </w:pPr>
+      <w:r>
+        <w:rPr>
+          <w:rFonts w:cs="Calibri"/>
           <w:color w:val="D86DCB" w:themeColor="accent5" w:themeTint="99"/>
           <w:sz w:val="32"/>
           <w:szCs w:val="32"/>
@@ -4446,23 +4213,18 @@
         <w:jc w:val="both"/>
         <w:rPr>
           <w:rFonts w:cs="Calibri"/>
-          <w:b/>
-          <w:bCs/>
-          <w:color w:val="D86DCB" w:themeColor="accent5" w:themeTint="99"/>
-          <w:sz w:val="32"/>
-          <w:szCs w:val="32"/>
-        </w:rPr>
-      </w:pPr>
-      <w:r>
-        <w:rPr>
-          <w:rFonts w:cs="Calibri"/>
-          <w:b/>
-          <w:bCs/>
-          <w:color w:val="D86DCB" w:themeColor="accent5" w:themeTint="99"/>
-          <w:sz w:val="32"/>
-          <w:szCs w:val="32"/>
-        </w:rPr>
-        <w:lastRenderedPageBreak/>
+          <w:color w:val="D86DCB" w:themeColor="accent5" w:themeTint="99"/>
+          <w:sz w:val="32"/>
+          <w:szCs w:val="32"/>
+        </w:rPr>
+      </w:pPr>
+      <w:r>
+        <w:rPr>
+          <w:rFonts w:cs="Calibri"/>
+          <w:color w:val="D86DCB" w:themeColor="accent5" w:themeTint="99"/>
+          <w:sz w:val="32"/>
+          <w:szCs w:val="32"/>
+        </w:rPr>
         <w:t xml:space="preserve">       Text('Title'),</w:t>
       </w:r>
     </w:p>
@@ -4471,18 +4233,14 @@
         <w:jc w:val="both"/>
         <w:rPr>
           <w:rFonts w:cs="Calibri"/>
-          <w:b/>
-          <w:bCs/>
-          <w:color w:val="D86DCB" w:themeColor="accent5" w:themeTint="99"/>
-          <w:sz w:val="32"/>
-          <w:szCs w:val="32"/>
-        </w:rPr>
-      </w:pPr>
-      <w:r>
-        <w:rPr>
-          <w:rFonts w:cs="Calibri"/>
-          <w:b/>
-          <w:bCs/>
+          <w:color w:val="D86DCB" w:themeColor="accent5" w:themeTint="99"/>
+          <w:sz w:val="32"/>
+          <w:szCs w:val="32"/>
+        </w:rPr>
+      </w:pPr>
+      <w:r>
+        <w:rPr>
+          <w:rFonts w:cs="Calibri"/>
           <w:color w:val="D86DCB" w:themeColor="accent5" w:themeTint="99"/>
           <w:sz w:val="32"/>
           <w:szCs w:val="32"/>
@@ -4493,8 +4251,6 @@
       <w:r>
         <w:rPr>
           <w:rFonts w:cs="Calibri"/>
-          <w:b/>
-          <w:bCs/>
           <w:color w:val="D86DCB" w:themeColor="accent5" w:themeTint="99"/>
           <w:sz w:val="32"/>
           <w:szCs w:val="32"/>
@@ -4506,8 +4262,6 @@
       <w:r>
         <w:rPr>
           <w:rFonts w:cs="Calibri"/>
-          <w:b/>
-          <w:bCs/>
           <w:color w:val="D86DCB" w:themeColor="accent5" w:themeTint="99"/>
           <w:sz w:val="32"/>
           <w:szCs w:val="32"/>
@@ -4518,8 +4272,6 @@
       <w:r>
         <w:rPr>
           <w:rFonts w:cs="Calibri"/>
-          <w:b/>
-          <w:bCs/>
           <w:color w:val="D86DCB" w:themeColor="accent5" w:themeTint="99"/>
           <w:sz w:val="32"/>
           <w:szCs w:val="32"/>
@@ -4530,8 +4282,6 @@
       <w:r>
         <w:rPr>
           <w:rFonts w:cs="Calibri"/>
-          <w:b/>
-          <w:bCs/>
           <w:color w:val="D86DCB" w:themeColor="accent5" w:themeTint="99"/>
           <w:sz w:val="32"/>
           <w:szCs w:val="32"/>
@@ -4542,8 +4292,6 @@
       <w:r>
         <w:rPr>
           <w:rFonts w:cs="Calibri"/>
-          <w:b/>
-          <w:bCs/>
           <w:color w:val="D86DCB" w:themeColor="accent5" w:themeTint="99"/>
           <w:sz w:val="32"/>
           <w:szCs w:val="32"/>
@@ -4556,30 +4304,25 @@
         <w:jc w:val="both"/>
         <w:rPr>
           <w:rFonts w:cs="Calibri"/>
-          <w:b/>
-          <w:bCs/>
-          <w:color w:val="D86DCB" w:themeColor="accent5" w:themeTint="99"/>
-          <w:sz w:val="32"/>
-          <w:szCs w:val="32"/>
-        </w:rPr>
-      </w:pPr>
-      <w:r>
-        <w:rPr>
-          <w:rFonts w:cs="Calibri"/>
-          <w:b/>
-          <w:bCs/>
-          <w:color w:val="D86DCB" w:themeColor="accent5" w:themeTint="99"/>
-          <w:sz w:val="32"/>
-          <w:szCs w:val="32"/>
-        </w:rPr>
+          <w:color w:val="D86DCB" w:themeColor="accent5" w:themeTint="99"/>
+          <w:sz w:val="32"/>
+          <w:szCs w:val="32"/>
+        </w:rPr>
+      </w:pPr>
+      <w:r>
+        <w:rPr>
+          <w:rFonts w:cs="Calibri"/>
+          <w:color w:val="D86DCB" w:themeColor="accent5" w:themeTint="99"/>
+          <w:sz w:val="32"/>
+          <w:szCs w:val="32"/>
+        </w:rPr>
+        <w:lastRenderedPageBreak/>
         <w:t xml:space="preserve">       </w:t>
       </w:r>
       <w:proofErr w:type="gramStart"/>
       <w:r>
         <w:rPr>
           <w:rFonts w:cs="Calibri"/>
-          <w:b/>
-          <w:bCs/>
           <w:color w:val="D86DCB" w:themeColor="accent5" w:themeTint="99"/>
           <w:sz w:val="32"/>
           <w:szCs w:val="32"/>
@@ -4591,8 +4334,6 @@
       <w:r>
         <w:rPr>
           <w:rFonts w:cs="Calibri"/>
-          <w:b/>
-          <w:bCs/>
           <w:color w:val="D86DCB" w:themeColor="accent5" w:themeTint="99"/>
           <w:sz w:val="32"/>
           <w:szCs w:val="32"/>
@@ -4603,8 +4344,6 @@
       <w:r>
         <w:rPr>
           <w:rFonts w:cs="Calibri"/>
-          <w:b/>
-          <w:bCs/>
           <w:color w:val="D86DCB" w:themeColor="accent5" w:themeTint="99"/>
           <w:sz w:val="32"/>
           <w:szCs w:val="32"/>
@@ -4615,8 +4354,6 @@
       <w:r>
         <w:rPr>
           <w:rFonts w:cs="Calibri"/>
-          <w:b/>
-          <w:bCs/>
           <w:color w:val="D86DCB" w:themeColor="accent5" w:themeTint="99"/>
           <w:sz w:val="32"/>
           <w:szCs w:val="32"/>
@@ -4627,8 +4364,6 @@
       <w:r>
         <w:rPr>
           <w:rFonts w:cs="Calibri"/>
-          <w:b/>
-          <w:bCs/>
           <w:color w:val="D86DCB" w:themeColor="accent5" w:themeTint="99"/>
           <w:sz w:val="32"/>
           <w:szCs w:val="32"/>
@@ -4641,18 +4376,14 @@
         <w:jc w:val="both"/>
         <w:rPr>
           <w:rFonts w:cs="Calibri"/>
-          <w:b/>
-          <w:bCs/>
-          <w:color w:val="D86DCB" w:themeColor="accent5" w:themeTint="99"/>
-          <w:sz w:val="32"/>
-          <w:szCs w:val="32"/>
-        </w:rPr>
-      </w:pPr>
-      <w:r>
-        <w:rPr>
-          <w:rFonts w:cs="Calibri"/>
-          <w:b/>
-          <w:bCs/>
+          <w:color w:val="D86DCB" w:themeColor="accent5" w:themeTint="99"/>
+          <w:sz w:val="32"/>
+          <w:szCs w:val="32"/>
+        </w:rPr>
+      </w:pPr>
+      <w:r>
+        <w:rPr>
+          <w:rFonts w:cs="Calibri"/>
           <w:color w:val="D86DCB" w:themeColor="accent5" w:themeTint="99"/>
           <w:sz w:val="32"/>
           <w:szCs w:val="32"/>
@@ -4663,8 +4394,6 @@
       <w:r>
         <w:rPr>
           <w:rFonts w:cs="Calibri"/>
-          <w:b/>
-          <w:bCs/>
           <w:color w:val="D86DCB" w:themeColor="accent5" w:themeTint="99"/>
           <w:sz w:val="32"/>
           <w:szCs w:val="32"/>
@@ -4676,8 +4405,6 @@
       <w:r>
         <w:rPr>
           <w:rFonts w:cs="Calibri"/>
-          <w:b/>
-          <w:bCs/>
           <w:color w:val="D86DCB" w:themeColor="accent5" w:themeTint="99"/>
           <w:sz w:val="32"/>
           <w:szCs w:val="32"/>
@@ -4688,8 +4415,6 @@
       <w:r>
         <w:rPr>
           <w:rFonts w:cs="Calibri"/>
-          <w:b/>
-          <w:bCs/>
           <w:color w:val="D86DCB" w:themeColor="accent5" w:themeTint="99"/>
           <w:sz w:val="32"/>
           <w:szCs w:val="32"/>
@@ -4700,8 +4425,6 @@
       <w:r>
         <w:rPr>
           <w:rFonts w:cs="Calibri"/>
-          <w:b/>
-          <w:bCs/>
           <w:color w:val="D86DCB" w:themeColor="accent5" w:themeTint="99"/>
           <w:sz w:val="32"/>
           <w:szCs w:val="32"/>
@@ -4712,8 +4435,6 @@
       <w:r>
         <w:rPr>
           <w:rFonts w:cs="Calibri"/>
-          <w:b/>
-          <w:bCs/>
           <w:color w:val="D86DCB" w:themeColor="accent5" w:themeTint="99"/>
           <w:sz w:val="32"/>
           <w:szCs w:val="32"/>
@@ -4726,18 +4447,14 @@
         <w:jc w:val="both"/>
         <w:rPr>
           <w:rFonts w:cs="Calibri"/>
-          <w:b/>
-          <w:bCs/>
-          <w:color w:val="D86DCB" w:themeColor="accent5" w:themeTint="99"/>
-          <w:sz w:val="32"/>
-          <w:szCs w:val="32"/>
-        </w:rPr>
-      </w:pPr>
-      <w:r>
-        <w:rPr>
-          <w:rFonts w:cs="Calibri"/>
-          <w:b/>
-          <w:bCs/>
+          <w:color w:val="D86DCB" w:themeColor="accent5" w:themeTint="99"/>
+          <w:sz w:val="32"/>
+          <w:szCs w:val="32"/>
+        </w:rPr>
+      </w:pPr>
+      <w:r>
+        <w:rPr>
+          <w:rFonts w:cs="Calibri"/>
           <w:color w:val="D86DCB" w:themeColor="accent5" w:themeTint="99"/>
           <w:sz w:val="32"/>
           <w:szCs w:val="32"/>
@@ -4750,18 +4467,14 @@
         <w:jc w:val="both"/>
         <w:rPr>
           <w:rFonts w:cs="Calibri"/>
-          <w:b/>
-          <w:bCs/>
-          <w:color w:val="D86DCB" w:themeColor="accent5" w:themeTint="99"/>
-          <w:sz w:val="32"/>
-          <w:szCs w:val="32"/>
-        </w:rPr>
-      </w:pPr>
-      <w:r>
-        <w:rPr>
-          <w:rFonts w:cs="Calibri"/>
-          <w:b/>
-          <w:bCs/>
+          <w:color w:val="D86DCB" w:themeColor="accent5" w:themeTint="99"/>
+          <w:sz w:val="32"/>
+          <w:szCs w:val="32"/>
+        </w:rPr>
+      </w:pPr>
+      <w:r>
+        <w:rPr>
+          <w:rFonts w:cs="Calibri"/>
           <w:color w:val="D86DCB" w:themeColor="accent5" w:themeTint="99"/>
           <w:sz w:val="32"/>
           <w:szCs w:val="32"/>
@@ -4808,8 +4521,6 @@
         <w:jc w:val="both"/>
         <w:rPr>
           <w:rFonts w:cs="Calibri"/>
-          <w:b/>
-          <w:bCs/>
           <w:color w:val="D86DCB" w:themeColor="accent5" w:themeTint="99"/>
           <w:sz w:val="32"/>
           <w:szCs w:val="32"/>
@@ -4819,8 +4530,6 @@
       <w:r>
         <w:rPr>
           <w:rFonts w:cs="Calibri"/>
-          <w:b/>
-          <w:bCs/>
           <w:color w:val="D86DCB" w:themeColor="accent5" w:themeTint="99"/>
           <w:sz w:val="32"/>
           <w:szCs w:val="32"/>
@@ -4834,18 +4543,14 @@
         <w:jc w:val="both"/>
         <w:rPr>
           <w:rFonts w:cs="Calibri"/>
-          <w:b/>
-          <w:bCs/>
-          <w:color w:val="D86DCB" w:themeColor="accent5" w:themeTint="99"/>
-          <w:sz w:val="32"/>
-          <w:szCs w:val="32"/>
-        </w:rPr>
-      </w:pPr>
-      <w:r>
-        <w:rPr>
-          <w:rFonts w:cs="Calibri"/>
-          <w:b/>
-          <w:bCs/>
+          <w:color w:val="D86DCB" w:themeColor="accent5" w:themeTint="99"/>
+          <w:sz w:val="32"/>
+          <w:szCs w:val="32"/>
+        </w:rPr>
+      </w:pPr>
+      <w:r>
+        <w:rPr>
+          <w:rFonts w:cs="Calibri"/>
           <w:color w:val="D86DCB" w:themeColor="accent5" w:themeTint="99"/>
           <w:sz w:val="32"/>
           <w:szCs w:val="32"/>
@@ -4858,18 +4563,14 @@
         <w:jc w:val="both"/>
         <w:rPr>
           <w:rFonts w:cs="Calibri"/>
-          <w:b/>
-          <w:bCs/>
-          <w:color w:val="D86DCB" w:themeColor="accent5" w:themeTint="99"/>
-          <w:sz w:val="32"/>
-          <w:szCs w:val="32"/>
-        </w:rPr>
-      </w:pPr>
-      <w:r>
-        <w:rPr>
-          <w:rFonts w:cs="Calibri"/>
-          <w:b/>
-          <w:bCs/>
+          <w:color w:val="D86DCB" w:themeColor="accent5" w:themeTint="99"/>
+          <w:sz w:val="32"/>
+          <w:szCs w:val="32"/>
+        </w:rPr>
+      </w:pPr>
+      <w:r>
+        <w:rPr>
+          <w:rFonts w:cs="Calibri"/>
           <w:color w:val="D86DCB" w:themeColor="accent5" w:themeTint="99"/>
           <w:sz w:val="32"/>
           <w:szCs w:val="32"/>
@@ -4882,18 +4583,14 @@
         <w:jc w:val="both"/>
         <w:rPr>
           <w:rFonts w:cs="Calibri"/>
-          <w:b/>
-          <w:bCs/>
-          <w:color w:val="D86DCB" w:themeColor="accent5" w:themeTint="99"/>
-          <w:sz w:val="32"/>
-          <w:szCs w:val="32"/>
-        </w:rPr>
-      </w:pPr>
-      <w:r>
-        <w:rPr>
-          <w:rFonts w:cs="Calibri"/>
-          <w:b/>
-          <w:bCs/>
+          <w:color w:val="D86DCB" w:themeColor="accent5" w:themeTint="99"/>
+          <w:sz w:val="32"/>
+          <w:szCs w:val="32"/>
+        </w:rPr>
+      </w:pPr>
+      <w:r>
+        <w:rPr>
+          <w:rFonts w:cs="Calibri"/>
           <w:color w:val="D86DCB" w:themeColor="accent5" w:themeTint="99"/>
           <w:sz w:val="32"/>
           <w:szCs w:val="32"/>
@@ -4904,8 +4601,6 @@
       <w:r>
         <w:rPr>
           <w:rFonts w:cs="Calibri"/>
-          <w:b/>
-          <w:bCs/>
           <w:color w:val="D86DCB" w:themeColor="accent5" w:themeTint="99"/>
           <w:sz w:val="32"/>
           <w:szCs w:val="32"/>
@@ -4916,8 +4611,6 @@
       <w:r>
         <w:rPr>
           <w:rFonts w:cs="Calibri"/>
-          <w:b/>
-          <w:bCs/>
           <w:color w:val="D86DCB" w:themeColor="accent5" w:themeTint="99"/>
           <w:sz w:val="32"/>
           <w:szCs w:val="32"/>
@@ -4929,8 +4622,6 @@
       <w:r>
         <w:rPr>
           <w:rFonts w:cs="Calibri"/>
-          <w:b/>
-          <w:bCs/>
           <w:color w:val="D86DCB" w:themeColor="accent5" w:themeTint="99"/>
           <w:sz w:val="32"/>
           <w:szCs w:val="32"/>
@@ -4943,18 +4634,14 @@
         <w:jc w:val="both"/>
         <w:rPr>
           <w:rFonts w:cs="Calibri"/>
-          <w:b/>
-          <w:bCs/>
-          <w:color w:val="D86DCB" w:themeColor="accent5" w:themeTint="99"/>
-          <w:sz w:val="32"/>
-          <w:szCs w:val="32"/>
-        </w:rPr>
-      </w:pPr>
-      <w:r>
-        <w:rPr>
-          <w:rFonts w:cs="Calibri"/>
-          <w:b/>
-          <w:bCs/>
+          <w:color w:val="D86DCB" w:themeColor="accent5" w:themeTint="99"/>
+          <w:sz w:val="32"/>
+          <w:szCs w:val="32"/>
+        </w:rPr>
+      </w:pPr>
+      <w:r>
+        <w:rPr>
+          <w:rFonts w:cs="Calibri"/>
           <w:color w:val="D86DCB" w:themeColor="accent5" w:themeTint="99"/>
           <w:sz w:val="32"/>
           <w:szCs w:val="32"/>
@@ -4965,8 +4652,6 @@
       <w:r>
         <w:rPr>
           <w:rFonts w:cs="Calibri"/>
-          <w:b/>
-          <w:bCs/>
           <w:color w:val="D86DCB" w:themeColor="accent5" w:themeTint="99"/>
           <w:sz w:val="32"/>
           <w:szCs w:val="32"/>
@@ -4977,8 +4662,6 @@
       <w:r>
         <w:rPr>
           <w:rFonts w:cs="Calibri"/>
-          <w:b/>
-          <w:bCs/>
           <w:color w:val="D86DCB" w:themeColor="accent5" w:themeTint="99"/>
           <w:sz w:val="32"/>
           <w:szCs w:val="32"/>
@@ -4990,8 +4673,6 @@
       <w:r>
         <w:rPr>
           <w:rFonts w:cs="Calibri"/>
-          <w:b/>
-          <w:bCs/>
           <w:color w:val="D86DCB" w:themeColor="accent5" w:themeTint="99"/>
           <w:sz w:val="32"/>
           <w:szCs w:val="32"/>
@@ -5004,18 +4685,14 @@
         <w:jc w:val="both"/>
         <w:rPr>
           <w:rFonts w:cs="Calibri"/>
-          <w:b/>
-          <w:bCs/>
-          <w:color w:val="D86DCB" w:themeColor="accent5" w:themeTint="99"/>
-          <w:sz w:val="32"/>
-          <w:szCs w:val="32"/>
-        </w:rPr>
-      </w:pPr>
-      <w:r>
-        <w:rPr>
-          <w:rFonts w:cs="Calibri"/>
-          <w:b/>
-          <w:bCs/>
+          <w:color w:val="D86DCB" w:themeColor="accent5" w:themeTint="99"/>
+          <w:sz w:val="32"/>
+          <w:szCs w:val="32"/>
+        </w:rPr>
+      </w:pPr>
+      <w:r>
+        <w:rPr>
+          <w:rFonts w:cs="Calibri"/>
           <w:color w:val="D86DCB" w:themeColor="accent5" w:themeTint="99"/>
           <w:sz w:val="32"/>
           <w:szCs w:val="32"/>
@@ -5026,8 +4703,6 @@
       <w:r>
         <w:rPr>
           <w:rFonts w:cs="Calibri"/>
-          <w:b/>
-          <w:bCs/>
           <w:color w:val="D86DCB" w:themeColor="accent5" w:themeTint="99"/>
           <w:sz w:val="32"/>
           <w:szCs w:val="32"/>
@@ -5038,8 +4713,6 @@
       <w:r>
         <w:rPr>
           <w:rFonts w:cs="Calibri"/>
-          <w:b/>
-          <w:bCs/>
           <w:color w:val="D86DCB" w:themeColor="accent5" w:themeTint="99"/>
           <w:sz w:val="32"/>
           <w:szCs w:val="32"/>
@@ -5051,8 +4724,6 @@
       <w:r>
         <w:rPr>
           <w:rFonts w:cs="Calibri"/>
-          <w:b/>
-          <w:bCs/>
           <w:color w:val="D86DCB" w:themeColor="accent5" w:themeTint="99"/>
           <w:sz w:val="32"/>
           <w:szCs w:val="32"/>
@@ -5065,18 +4736,14 @@
         <w:jc w:val="both"/>
         <w:rPr>
           <w:rFonts w:cs="Calibri"/>
-          <w:b/>
-          <w:bCs/>
-          <w:color w:val="D86DCB" w:themeColor="accent5" w:themeTint="99"/>
-          <w:sz w:val="32"/>
-          <w:szCs w:val="32"/>
-        </w:rPr>
-      </w:pPr>
-      <w:r>
-        <w:rPr>
-          <w:rFonts w:cs="Calibri"/>
-          <w:b/>
-          <w:bCs/>
+          <w:color w:val="D86DCB" w:themeColor="accent5" w:themeTint="99"/>
+          <w:sz w:val="32"/>
+          <w:szCs w:val="32"/>
+        </w:rPr>
+      </w:pPr>
+      <w:r>
+        <w:rPr>
+          <w:rFonts w:cs="Calibri"/>
           <w:color w:val="D86DCB" w:themeColor="accent5" w:themeTint="99"/>
           <w:sz w:val="32"/>
           <w:szCs w:val="32"/>
@@ -5089,18 +4756,14 @@
         <w:jc w:val="both"/>
         <w:rPr>
           <w:rFonts w:cs="Calibri"/>
-          <w:b/>
-          <w:bCs/>
-          <w:color w:val="D86DCB" w:themeColor="accent5" w:themeTint="99"/>
-          <w:sz w:val="32"/>
-          <w:szCs w:val="32"/>
-        </w:rPr>
-      </w:pPr>
-      <w:r>
-        <w:rPr>
-          <w:rFonts w:cs="Calibri"/>
-          <w:b/>
-          <w:bCs/>
+          <w:color w:val="D86DCB" w:themeColor="accent5" w:themeTint="99"/>
+          <w:sz w:val="32"/>
+          <w:szCs w:val="32"/>
+        </w:rPr>
+      </w:pPr>
+      <w:r>
+        <w:rPr>
+          <w:rFonts w:cs="Calibri"/>
           <w:color w:val="D86DCB" w:themeColor="accent5" w:themeTint="99"/>
           <w:sz w:val="32"/>
           <w:szCs w:val="32"/>
@@ -5307,8 +4970,6 @@
         <w:jc w:val="both"/>
         <w:rPr>
           <w:rFonts w:cs="Calibri"/>
-          <w:b/>
-          <w:bCs/>
           <w:color w:val="D86DCB" w:themeColor="accent5" w:themeTint="99"/>
           <w:sz w:val="32"/>
           <w:szCs w:val="32"/>
@@ -5318,8 +4979,6 @@
       <w:r>
         <w:rPr>
           <w:rFonts w:cs="Calibri"/>
-          <w:b/>
-          <w:bCs/>
           <w:color w:val="D86DCB" w:themeColor="accent5" w:themeTint="99"/>
           <w:sz w:val="32"/>
           <w:szCs w:val="32"/>
@@ -5333,23 +4992,200 @@
         <w:jc w:val="both"/>
         <w:rPr>
           <w:rFonts w:cs="Calibri"/>
-          <w:b/>
-          <w:bCs/>
-          <w:color w:val="D86DCB" w:themeColor="accent5" w:themeTint="99"/>
-          <w:sz w:val="32"/>
-          <w:szCs w:val="32"/>
-        </w:rPr>
-      </w:pPr>
-      <w:r>
-        <w:rPr>
-          <w:rFonts w:cs="Calibri"/>
-          <w:b/>
-          <w:bCs/>
+          <w:color w:val="D86DCB" w:themeColor="accent5" w:themeTint="99"/>
+          <w:sz w:val="32"/>
+          <w:szCs w:val="32"/>
+        </w:rPr>
+      </w:pPr>
+      <w:r>
+        <w:rPr>
+          <w:rFonts w:cs="Calibri"/>
+          <w:color w:val="D86DCB" w:themeColor="accent5" w:themeTint="99"/>
+          <w:sz w:val="32"/>
+          <w:szCs w:val="32"/>
+        </w:rPr>
+        <w:t>…</w:t>
+      </w:r>
+    </w:p>
+    <w:p>
+      <w:pPr>
+        <w:jc w:val="both"/>
+        <w:rPr>
+          <w:rFonts w:cs="Calibri"/>
+          <w:color w:val="D86DCB" w:themeColor="accent5" w:themeTint="99"/>
+          <w:sz w:val="32"/>
+          <w:szCs w:val="32"/>
+        </w:rPr>
+      </w:pPr>
+      <w:r>
+        <w:rPr>
+          <w:rFonts w:cs="Calibri"/>
+          <w:color w:val="D86DCB" w:themeColor="accent5" w:themeTint="99"/>
+          <w:sz w:val="32"/>
+          <w:szCs w:val="32"/>
+        </w:rPr>
+        <w:t xml:space="preserve">   [</w:t>
+      </w:r>
+    </w:p>
+    <w:p>
+      <w:pPr>
+        <w:jc w:val="both"/>
+        <w:rPr>
+          <w:rFonts w:cs="Calibri"/>
+          <w:color w:val="D86DCB" w:themeColor="accent5" w:themeTint="99"/>
+          <w:sz w:val="32"/>
+          <w:szCs w:val="32"/>
+        </w:rPr>
+      </w:pPr>
+      <w:r>
+        <w:rPr>
+          <w:rFonts w:cs="Calibri"/>
           <w:color w:val="D86DCB" w:themeColor="accent5" w:themeTint="99"/>
           <w:sz w:val="32"/>
           <w:szCs w:val="32"/>
         </w:rPr>
         <w:lastRenderedPageBreak/>
+        <w:t xml:space="preserve">      </w:t>
+      </w:r>
+      <w:proofErr w:type="gramStart"/>
+      <w:r>
+        <w:rPr>
+          <w:rFonts w:cs="Calibri"/>
+          <w:color w:val="D86DCB" w:themeColor="accent5" w:themeTint="99"/>
+          <w:sz w:val="32"/>
+          <w:szCs w:val="32"/>
+        </w:rPr>
+        <w:t>?widget</w:t>
+      </w:r>
+      <w:proofErr w:type="gramEnd"/>
+    </w:p>
+    <w:p>
+      <w:pPr>
+        <w:jc w:val="both"/>
+        <w:rPr>
+          <w:rFonts w:cs="Calibri"/>
+          <w:color w:val="D86DCB" w:themeColor="accent5" w:themeTint="99"/>
+          <w:sz w:val="32"/>
+          <w:szCs w:val="32"/>
+        </w:rPr>
+      </w:pPr>
+      <w:r>
+        <w:rPr>
+          <w:rFonts w:cs="Calibri"/>
+          <w:color w:val="D86DCB" w:themeColor="accent5" w:themeTint="99"/>
+          <w:sz w:val="32"/>
+          <w:szCs w:val="32"/>
+        </w:rPr>
+        <w:t xml:space="preserve">  ]</w:t>
+      </w:r>
+    </w:p>
+    <w:p>
+      <w:pPr>
+        <w:jc w:val="both"/>
+        <w:rPr>
+          <w:rFonts w:cs="Calibri"/>
+          <w:color w:val="D86DCB" w:themeColor="accent5" w:themeTint="99"/>
+          <w:sz w:val="32"/>
+          <w:szCs w:val="32"/>
+        </w:rPr>
+      </w:pPr>
+      <w:r>
+        <w:rPr>
+          <w:rFonts w:cs="Calibri"/>
+          <w:color w:val="D86DCB" w:themeColor="accent5" w:themeTint="99"/>
+          <w:sz w:val="32"/>
+          <w:szCs w:val="32"/>
+        </w:rPr>
+        <w:t>)</w:t>
+      </w:r>
+    </w:p>
+    <w:p>
+      <w:pPr>
+        <w:jc w:val="both"/>
+        <w:rPr>
+          <w:rFonts w:cs="Calibri"/>
+          <w:sz w:val="32"/>
+          <w:szCs w:val="32"/>
+        </w:rPr>
+      </w:pPr>
+      <w:r>
+        <w:rPr>
+          <w:rFonts w:cs="Calibri"/>
+          <w:sz w:val="32"/>
+          <w:szCs w:val="32"/>
+        </w:rPr>
+        <w:t># While</w:t>
+      </w:r>
+      <w:r>
+        <w:rPr>
+          <w:rFonts w:cs="Calibri"/>
+          <w:b/>
+          <w:bCs/>
+          <w:sz w:val="32"/>
+          <w:szCs w:val="32"/>
+        </w:rPr>
+        <w:t xml:space="preserve"> </w:t>
+      </w:r>
+      <w:proofErr w:type="gramStart"/>
+      <w:r>
+        <w:rPr>
+          <w:rFonts w:cs="Calibri"/>
+          <w:b/>
+          <w:bCs/>
+          <w:sz w:val="32"/>
+          <w:szCs w:val="32"/>
+        </w:rPr>
+        <w:t>…?list</w:t>
+      </w:r>
+      <w:proofErr w:type="gramEnd"/>
+      <w:r>
+        <w:rPr>
+          <w:rFonts w:cs="Calibri"/>
+          <w:sz w:val="32"/>
+          <w:szCs w:val="32"/>
+        </w:rPr>
+        <w:t xml:space="preserve"> adds many nullable items (if not null)</w:t>
+      </w:r>
+    </w:p>
+    <w:p>
+      <w:pPr>
+        <w:jc w:val="both"/>
+        <w:rPr>
+          <w:rFonts w:cs="Calibri"/>
+          <w:color w:val="D86DCB" w:themeColor="accent5" w:themeTint="99"/>
+          <w:sz w:val="32"/>
+          <w:szCs w:val="32"/>
+        </w:rPr>
+      </w:pPr>
+      <w:proofErr w:type="gramStart"/>
+      <w:r>
+        <w:rPr>
+          <w:rFonts w:cs="Calibri"/>
+          <w:color w:val="D86DCB" w:themeColor="accent5" w:themeTint="99"/>
+          <w:sz w:val="32"/>
+          <w:szCs w:val="32"/>
+        </w:rPr>
+        <w:t>Row(</w:t>
+      </w:r>
+      <w:proofErr w:type="gramEnd"/>
+    </w:p>
+    <w:p>
+      <w:pPr>
+        <w:jc w:val="both"/>
+        <w:rPr>
+          <w:rFonts w:cs="Calibri"/>
+          <w:color w:val="D86DCB" w:themeColor="accent5" w:themeTint="99"/>
+          <w:sz w:val="32"/>
+          <w:szCs w:val="32"/>
+        </w:rPr>
+      </w:pPr>
+      <w:r>
+        <w:rPr>
+          <w:rFonts w:cs="Calibri"/>
+          <w:color w:val="D86DCB" w:themeColor="accent5" w:themeTint="99"/>
+          <w:sz w:val="32"/>
+          <w:szCs w:val="32"/>
+        </w:rPr>
         <w:t>…</w:t>
       </w:r>
     </w:p>
@@ -5358,18 +5194,14 @@
         <w:jc w:val="both"/>
         <w:rPr>
           <w:rFonts w:cs="Calibri"/>
-          <w:b/>
-          <w:bCs/>
-          <w:color w:val="D86DCB" w:themeColor="accent5" w:themeTint="99"/>
-          <w:sz w:val="32"/>
-          <w:szCs w:val="32"/>
-        </w:rPr>
-      </w:pPr>
-      <w:r>
-        <w:rPr>
-          <w:rFonts w:cs="Calibri"/>
-          <w:b/>
-          <w:bCs/>
+          <w:color w:val="D86DCB" w:themeColor="accent5" w:themeTint="99"/>
+          <w:sz w:val="32"/>
+          <w:szCs w:val="32"/>
+        </w:rPr>
+      </w:pPr>
+      <w:r>
+        <w:rPr>
+          <w:rFonts w:cs="Calibri"/>
           <w:color w:val="D86DCB" w:themeColor="accent5" w:themeTint="99"/>
           <w:sz w:val="32"/>
           <w:szCs w:val="32"/>
@@ -5382,18 +5214,14 @@
         <w:jc w:val="both"/>
         <w:rPr>
           <w:rFonts w:cs="Calibri"/>
-          <w:b/>
-          <w:bCs/>
-          <w:color w:val="D86DCB" w:themeColor="accent5" w:themeTint="99"/>
-          <w:sz w:val="32"/>
-          <w:szCs w:val="32"/>
-        </w:rPr>
-      </w:pPr>
-      <w:r>
-        <w:rPr>
-          <w:rFonts w:cs="Calibri"/>
-          <w:b/>
-          <w:bCs/>
+          <w:color w:val="D86DCB" w:themeColor="accent5" w:themeTint="99"/>
+          <w:sz w:val="32"/>
+          <w:szCs w:val="32"/>
+        </w:rPr>
+      </w:pPr>
+      <w:r>
+        <w:rPr>
+          <w:rFonts w:cs="Calibri"/>
           <w:color w:val="D86DCB" w:themeColor="accent5" w:themeTint="99"/>
           <w:sz w:val="32"/>
           <w:szCs w:val="32"/>
@@ -5404,13 +5232,11 @@
       <w:r>
         <w:rPr>
           <w:rFonts w:cs="Calibri"/>
-          <w:b/>
-          <w:bCs/>
-          <w:color w:val="D86DCB" w:themeColor="accent5" w:themeTint="99"/>
-          <w:sz w:val="32"/>
-          <w:szCs w:val="32"/>
-        </w:rPr>
-        <w:t>?widget</w:t>
+          <w:color w:val="D86DCB" w:themeColor="accent5" w:themeTint="99"/>
+          <w:sz w:val="32"/>
+          <w:szCs w:val="32"/>
+        </w:rPr>
+        <w:t>…?widgets</w:t>
       </w:r>
       <w:proofErr w:type="gramEnd"/>
     </w:p>
@@ -5419,18 +5245,14 @@
         <w:jc w:val="both"/>
         <w:rPr>
           <w:rFonts w:cs="Calibri"/>
-          <w:b/>
-          <w:bCs/>
-          <w:color w:val="D86DCB" w:themeColor="accent5" w:themeTint="99"/>
-          <w:sz w:val="32"/>
-          <w:szCs w:val="32"/>
-        </w:rPr>
-      </w:pPr>
-      <w:r>
-        <w:rPr>
-          <w:rFonts w:cs="Calibri"/>
-          <w:b/>
-          <w:bCs/>
+          <w:color w:val="D86DCB" w:themeColor="accent5" w:themeTint="99"/>
+          <w:sz w:val="32"/>
+          <w:szCs w:val="32"/>
+        </w:rPr>
+      </w:pPr>
+      <w:r>
+        <w:rPr>
+          <w:rFonts w:cs="Calibri"/>
           <w:color w:val="D86DCB" w:themeColor="accent5" w:themeTint="99"/>
           <w:sz w:val="32"/>
           <w:szCs w:val="32"/>
@@ -5443,225 +5265,14 @@
         <w:jc w:val="both"/>
         <w:rPr>
           <w:rFonts w:cs="Calibri"/>
-          <w:b/>
-          <w:bCs/>
-          <w:color w:val="D86DCB" w:themeColor="accent5" w:themeTint="99"/>
-          <w:sz w:val="32"/>
-          <w:szCs w:val="32"/>
-        </w:rPr>
-      </w:pPr>
-      <w:r>
-        <w:rPr>
-          <w:rFonts w:cs="Calibri"/>
-          <w:b/>
-          <w:bCs/>
-          <w:color w:val="D86DCB" w:themeColor="accent5" w:themeTint="99"/>
-          <w:sz w:val="32"/>
-          <w:szCs w:val="32"/>
-        </w:rPr>
-        <w:t>)</w:t>
-      </w:r>
-    </w:p>
-    <w:p>
-      <w:pPr>
-        <w:jc w:val="both"/>
-        <w:rPr>
-          <w:rFonts w:cs="Calibri"/>
-          <w:sz w:val="32"/>
-          <w:szCs w:val="32"/>
-        </w:rPr>
-      </w:pPr>
-      <w:r>
-        <w:rPr>
-          <w:rFonts w:cs="Calibri"/>
-          <w:sz w:val="32"/>
-          <w:szCs w:val="32"/>
-        </w:rPr>
-        <w:t># While</w:t>
-      </w:r>
-      <w:r>
-        <w:rPr>
-          <w:rFonts w:cs="Calibri"/>
-          <w:b/>
-          <w:bCs/>
-          <w:sz w:val="32"/>
-          <w:szCs w:val="32"/>
-        </w:rPr>
-        <w:t xml:space="preserve"> </w:t>
-      </w:r>
-      <w:proofErr w:type="gramStart"/>
-      <w:r>
-        <w:rPr>
-          <w:rFonts w:cs="Calibri"/>
-          <w:b/>
-          <w:bCs/>
-          <w:sz w:val="32"/>
-          <w:szCs w:val="32"/>
-        </w:rPr>
-        <w:t>…?list</w:t>
-      </w:r>
-      <w:proofErr w:type="gramEnd"/>
-      <w:r>
-        <w:rPr>
-          <w:rFonts w:cs="Calibri"/>
-          <w:sz w:val="32"/>
-          <w:szCs w:val="32"/>
-        </w:rPr>
-        <w:t xml:space="preserve"> adds many nullable items (if not null)</w:t>
-      </w:r>
-    </w:p>
-    <w:p>
-      <w:pPr>
-        <w:jc w:val="both"/>
-        <w:rPr>
-          <w:rFonts w:cs="Calibri"/>
-          <w:b/>
-          <w:bCs/>
-          <w:color w:val="D86DCB" w:themeColor="accent5" w:themeTint="99"/>
-          <w:sz w:val="32"/>
-          <w:szCs w:val="32"/>
-        </w:rPr>
-      </w:pPr>
-      <w:proofErr w:type="gramStart"/>
-      <w:r>
-        <w:rPr>
-          <w:rFonts w:cs="Calibri"/>
-          <w:b/>
-          <w:bCs/>
-          <w:color w:val="D86DCB" w:themeColor="accent5" w:themeTint="99"/>
-          <w:sz w:val="32"/>
-          <w:szCs w:val="32"/>
-        </w:rPr>
-        <w:t>Row(</w:t>
-      </w:r>
-      <w:proofErr w:type="gramEnd"/>
-    </w:p>
-    <w:p>
-      <w:pPr>
-        <w:jc w:val="both"/>
-        <w:rPr>
-          <w:rFonts w:cs="Calibri"/>
-          <w:b/>
-          <w:bCs/>
-          <w:color w:val="D86DCB" w:themeColor="accent5" w:themeTint="99"/>
-          <w:sz w:val="32"/>
-          <w:szCs w:val="32"/>
-        </w:rPr>
-      </w:pPr>
-      <w:r>
-        <w:rPr>
-          <w:rFonts w:cs="Calibri"/>
-          <w:b/>
-          <w:bCs/>
-          <w:color w:val="D86DCB" w:themeColor="accent5" w:themeTint="99"/>
-          <w:sz w:val="32"/>
-          <w:szCs w:val="32"/>
-        </w:rPr>
-        <w:t>…</w:t>
-      </w:r>
-    </w:p>
-    <w:p>
-      <w:pPr>
-        <w:jc w:val="both"/>
-        <w:rPr>
-          <w:rFonts w:cs="Calibri"/>
-          <w:b/>
-          <w:bCs/>
-          <w:color w:val="D86DCB" w:themeColor="accent5" w:themeTint="99"/>
-          <w:sz w:val="32"/>
-          <w:szCs w:val="32"/>
-        </w:rPr>
-      </w:pPr>
-      <w:r>
-        <w:rPr>
-          <w:rFonts w:cs="Calibri"/>
-          <w:b/>
-          <w:bCs/>
-          <w:color w:val="D86DCB" w:themeColor="accent5" w:themeTint="99"/>
-          <w:sz w:val="32"/>
-          <w:szCs w:val="32"/>
-        </w:rPr>
-        <w:t xml:space="preserve">   [</w:t>
-      </w:r>
-    </w:p>
-    <w:p>
-      <w:pPr>
-        <w:jc w:val="both"/>
-        <w:rPr>
-          <w:rFonts w:cs="Calibri"/>
-          <w:b/>
-          <w:bCs/>
-          <w:color w:val="D86DCB" w:themeColor="accent5" w:themeTint="99"/>
-          <w:sz w:val="32"/>
-          <w:szCs w:val="32"/>
-        </w:rPr>
-      </w:pPr>
-      <w:r>
-        <w:rPr>
-          <w:rFonts w:cs="Calibri"/>
-          <w:b/>
-          <w:bCs/>
-          <w:color w:val="D86DCB" w:themeColor="accent5" w:themeTint="99"/>
-          <w:sz w:val="32"/>
-          <w:szCs w:val="32"/>
-        </w:rPr>
-        <w:t xml:space="preserve">      </w:t>
-      </w:r>
-      <w:proofErr w:type="gramStart"/>
-      <w:r>
-        <w:rPr>
-          <w:rFonts w:cs="Calibri"/>
-          <w:b/>
-          <w:bCs/>
-          <w:color w:val="D86DCB" w:themeColor="accent5" w:themeTint="99"/>
-          <w:sz w:val="32"/>
-          <w:szCs w:val="32"/>
-        </w:rPr>
-        <w:t>…?widgets</w:t>
-      </w:r>
-      <w:proofErr w:type="gramEnd"/>
-    </w:p>
-    <w:p>
-      <w:pPr>
-        <w:jc w:val="both"/>
-        <w:rPr>
-          <w:rFonts w:cs="Calibri"/>
-          <w:b/>
-          <w:bCs/>
-          <w:color w:val="D86DCB" w:themeColor="accent5" w:themeTint="99"/>
-          <w:sz w:val="32"/>
-          <w:szCs w:val="32"/>
-        </w:rPr>
-      </w:pPr>
-      <w:r>
-        <w:rPr>
-          <w:rFonts w:cs="Calibri"/>
-          <w:b/>
-          <w:bCs/>
-          <w:color w:val="D86DCB" w:themeColor="accent5" w:themeTint="99"/>
-          <w:sz w:val="32"/>
-          <w:szCs w:val="32"/>
-        </w:rPr>
-        <w:t xml:space="preserve">  ]</w:t>
-      </w:r>
-    </w:p>
-    <w:p>
-      <w:pPr>
-        <w:jc w:val="both"/>
-        <w:rPr>
-          <w:rFonts w:cs="Calibri"/>
-          <w:b/>
-          <w:bCs/>
-          <w:color w:val="D86DCB" w:themeColor="accent5" w:themeTint="99"/>
-          <w:sz w:val="32"/>
-          <w:szCs w:val="32"/>
-        </w:rPr>
-      </w:pPr>
-      <w:r>
-        <w:rPr>
-          <w:rFonts w:cs="Calibri"/>
-          <w:b/>
-          <w:bCs/>
+          <w:color w:val="D86DCB" w:themeColor="accent5" w:themeTint="99"/>
+          <w:sz w:val="32"/>
+          <w:szCs w:val="32"/>
+        </w:rPr>
+      </w:pPr>
+      <w:r>
+        <w:rPr>
+          <w:rFonts w:cs="Calibri"/>
           <w:color w:val="D86DCB" w:themeColor="accent5" w:themeTint="99"/>
           <w:sz w:val="32"/>
           <w:szCs w:val="32"/>
@@ -5934,25 +5545,25 @@
           <w:sz w:val="32"/>
           <w:szCs w:val="32"/>
         </w:rPr>
+        <w:t>Null-aware Spread Operator:</w:t>
+      </w:r>
+    </w:p>
+    <w:p>
+      <w:pPr>
+        <w:jc w:val="both"/>
+        <w:rPr>
+          <w:rFonts w:cs="Calibri"/>
+          <w:sz w:val="32"/>
+          <w:szCs w:val="32"/>
+        </w:rPr>
+      </w:pPr>
+      <w:r>
+        <w:rPr>
+          <w:rFonts w:cs="Calibri"/>
+          <w:sz w:val="32"/>
+          <w:szCs w:val="32"/>
+        </w:rPr>
         <w:lastRenderedPageBreak/>
-        <w:t>Null-aware Spread Operator:</w:t>
-      </w:r>
-    </w:p>
-    <w:p>
-      <w:pPr>
-        <w:jc w:val="both"/>
-        <w:rPr>
-          <w:rFonts w:cs="Calibri"/>
-          <w:sz w:val="32"/>
-          <w:szCs w:val="32"/>
-        </w:rPr>
-      </w:pPr>
-      <w:r>
-        <w:rPr>
-          <w:rFonts w:cs="Calibri"/>
-          <w:sz w:val="32"/>
-          <w:szCs w:val="32"/>
-        </w:rPr>
         <w:t># By using Null-aware Spread Operator (</w:t>
       </w:r>
       <w:r>
@@ -6069,18 +5680,14 @@
         <w:jc w:val="both"/>
         <w:rPr>
           <w:rFonts w:cs="Calibri"/>
-          <w:b/>
-          <w:bCs/>
-          <w:color w:val="D86DCB" w:themeColor="accent5" w:themeTint="99"/>
-          <w:sz w:val="32"/>
-          <w:szCs w:val="32"/>
-        </w:rPr>
-      </w:pPr>
-      <w:r>
-        <w:rPr>
-          <w:rFonts w:cs="Calibri"/>
-          <w:b/>
-          <w:bCs/>
+          <w:color w:val="D86DCB" w:themeColor="accent5" w:themeTint="99"/>
+          <w:sz w:val="32"/>
+          <w:szCs w:val="32"/>
+        </w:rPr>
+      </w:pPr>
+      <w:r>
+        <w:rPr>
+          <w:rFonts w:cs="Calibri"/>
           <w:color w:val="D86DCB" w:themeColor="accent5" w:themeTint="99"/>
           <w:sz w:val="32"/>
           <w:szCs w:val="32"/>
@@ -6093,18 +5700,14 @@
         <w:jc w:val="both"/>
         <w:rPr>
           <w:rFonts w:cs="Calibri"/>
-          <w:b/>
-          <w:bCs/>
-          <w:color w:val="D86DCB" w:themeColor="accent5" w:themeTint="99"/>
-          <w:sz w:val="32"/>
-          <w:szCs w:val="32"/>
-        </w:rPr>
-      </w:pPr>
-      <w:r>
-        <w:rPr>
-          <w:rFonts w:cs="Calibri"/>
-          <w:b/>
-          <w:bCs/>
+          <w:color w:val="D86DCB" w:themeColor="accent5" w:themeTint="99"/>
+          <w:sz w:val="32"/>
+          <w:szCs w:val="32"/>
+        </w:rPr>
+      </w:pPr>
+      <w:r>
+        <w:rPr>
+          <w:rFonts w:cs="Calibri"/>
           <w:color w:val="D86DCB" w:themeColor="accent5" w:themeTint="99"/>
           <w:sz w:val="32"/>
           <w:szCs w:val="32"/>
@@ -6115,8 +5718,6 @@
       <w:r>
         <w:rPr>
           <w:rFonts w:cs="Calibri"/>
-          <w:b/>
-          <w:bCs/>
           <w:color w:val="D86DCB" w:themeColor="accent5" w:themeTint="99"/>
           <w:sz w:val="32"/>
           <w:szCs w:val="32"/>
@@ -6127,8 +5728,6 @@
       <w:r>
         <w:rPr>
           <w:rFonts w:cs="Calibri"/>
-          <w:b/>
-          <w:bCs/>
           <w:color w:val="D86DCB" w:themeColor="accent5" w:themeTint="99"/>
           <w:sz w:val="32"/>
           <w:szCs w:val="32"/>
@@ -6141,18 +5740,14 @@
         <w:jc w:val="both"/>
         <w:rPr>
           <w:rFonts w:cs="Calibri"/>
-          <w:b/>
-          <w:bCs/>
-          <w:color w:val="D86DCB" w:themeColor="accent5" w:themeTint="99"/>
-          <w:sz w:val="32"/>
-          <w:szCs w:val="32"/>
-        </w:rPr>
-      </w:pPr>
-      <w:r>
-        <w:rPr>
-          <w:rFonts w:cs="Calibri"/>
-          <w:b/>
-          <w:bCs/>
+          <w:color w:val="D86DCB" w:themeColor="accent5" w:themeTint="99"/>
+          <w:sz w:val="32"/>
+          <w:szCs w:val="32"/>
+        </w:rPr>
+      </w:pPr>
+      <w:r>
+        <w:rPr>
+          <w:rFonts w:cs="Calibri"/>
           <w:color w:val="D86DCB" w:themeColor="accent5" w:themeTint="99"/>
           <w:sz w:val="32"/>
           <w:szCs w:val="32"/>
@@ -6165,18 +5760,14 @@
         <w:jc w:val="both"/>
         <w:rPr>
           <w:rFonts w:cs="Calibri"/>
-          <w:b/>
-          <w:bCs/>
-          <w:color w:val="D86DCB" w:themeColor="accent5" w:themeTint="99"/>
-          <w:sz w:val="32"/>
-          <w:szCs w:val="32"/>
-        </w:rPr>
-      </w:pPr>
-      <w:r>
-        <w:rPr>
-          <w:rFonts w:cs="Calibri"/>
-          <w:b/>
-          <w:bCs/>
+          <w:color w:val="D86DCB" w:themeColor="accent5" w:themeTint="99"/>
+          <w:sz w:val="32"/>
+          <w:szCs w:val="32"/>
+        </w:rPr>
+      </w:pPr>
+      <w:r>
+        <w:rPr>
+          <w:rFonts w:cs="Calibri"/>
           <w:color w:val="D86DCB" w:themeColor="accent5" w:themeTint="99"/>
           <w:sz w:val="32"/>
           <w:szCs w:val="32"/>
@@ -6189,18 +5780,14 @@
         <w:jc w:val="both"/>
         <w:rPr>
           <w:rFonts w:cs="Calibri"/>
-          <w:b/>
-          <w:bCs/>
-          <w:color w:val="D86DCB" w:themeColor="accent5" w:themeTint="99"/>
-          <w:sz w:val="32"/>
-          <w:szCs w:val="32"/>
-        </w:rPr>
-      </w:pPr>
-      <w:r>
-        <w:rPr>
-          <w:rFonts w:cs="Calibri"/>
-          <w:b/>
-          <w:bCs/>
+          <w:color w:val="D86DCB" w:themeColor="accent5" w:themeTint="99"/>
+          <w:sz w:val="32"/>
+          <w:szCs w:val="32"/>
+        </w:rPr>
+      </w:pPr>
+      <w:r>
+        <w:rPr>
+          <w:rFonts w:cs="Calibri"/>
           <w:color w:val="D86DCB" w:themeColor="accent5" w:themeTint="99"/>
           <w:sz w:val="32"/>
           <w:szCs w:val="32"/>
@@ -6213,18 +5800,14 @@
         <w:jc w:val="both"/>
         <w:rPr>
           <w:rFonts w:cs="Calibri"/>
-          <w:b/>
-          <w:bCs/>
-          <w:color w:val="D86DCB" w:themeColor="accent5" w:themeTint="99"/>
-          <w:sz w:val="32"/>
-          <w:szCs w:val="32"/>
-        </w:rPr>
-      </w:pPr>
-      <w:r>
-        <w:rPr>
-          <w:rFonts w:cs="Calibri"/>
-          <w:b/>
-          <w:bCs/>
+          <w:color w:val="D86DCB" w:themeColor="accent5" w:themeTint="99"/>
+          <w:sz w:val="32"/>
+          <w:szCs w:val="32"/>
+        </w:rPr>
+      </w:pPr>
+      <w:r>
+        <w:rPr>
+          <w:rFonts w:cs="Calibri"/>
           <w:color w:val="D86DCB" w:themeColor="accent5" w:themeTint="99"/>
           <w:sz w:val="32"/>
           <w:szCs w:val="32"/>
@@ -6237,18 +5820,14 @@
         <w:jc w:val="both"/>
         <w:rPr>
           <w:rFonts w:cs="Calibri"/>
-          <w:b/>
-          <w:bCs/>
-          <w:color w:val="D86DCB" w:themeColor="accent5" w:themeTint="99"/>
-          <w:sz w:val="32"/>
-          <w:szCs w:val="32"/>
-        </w:rPr>
-      </w:pPr>
-      <w:r>
-        <w:rPr>
-          <w:rFonts w:cs="Calibri"/>
-          <w:b/>
-          <w:bCs/>
+          <w:color w:val="D86DCB" w:themeColor="accent5" w:themeTint="99"/>
+          <w:sz w:val="32"/>
+          <w:szCs w:val="32"/>
+        </w:rPr>
+      </w:pPr>
+      <w:r>
+        <w:rPr>
+          <w:rFonts w:cs="Calibri"/>
           <w:color w:val="D86DCB" w:themeColor="accent5" w:themeTint="99"/>
           <w:sz w:val="32"/>
           <w:szCs w:val="32"/>
@@ -6259,8 +5838,6 @@
       <w:r>
         <w:rPr>
           <w:rFonts w:cs="Calibri"/>
-          <w:b/>
-          <w:bCs/>
           <w:color w:val="D86DCB" w:themeColor="accent5" w:themeTint="99"/>
           <w:sz w:val="32"/>
           <w:szCs w:val="32"/>
@@ -6271,8 +5848,6 @@
       <w:r>
         <w:rPr>
           <w:rFonts w:cs="Calibri"/>
-          <w:b/>
-          <w:bCs/>
           <w:color w:val="D86DCB" w:themeColor="accent5" w:themeTint="99"/>
           <w:sz w:val="32"/>
           <w:szCs w:val="32"/>
@@ -6285,18 +5860,14 @@
         <w:jc w:val="both"/>
         <w:rPr>
           <w:rFonts w:cs="Calibri"/>
-          <w:b/>
-          <w:bCs/>
-          <w:color w:val="D86DCB" w:themeColor="accent5" w:themeTint="99"/>
-          <w:sz w:val="32"/>
-          <w:szCs w:val="32"/>
-        </w:rPr>
-      </w:pPr>
-      <w:r>
-        <w:rPr>
-          <w:rFonts w:cs="Calibri"/>
-          <w:b/>
-          <w:bCs/>
+          <w:color w:val="D86DCB" w:themeColor="accent5" w:themeTint="99"/>
+          <w:sz w:val="32"/>
+          <w:szCs w:val="32"/>
+        </w:rPr>
+      </w:pPr>
+      <w:r>
+        <w:rPr>
+          <w:rFonts w:cs="Calibri"/>
           <w:color w:val="D86DCB" w:themeColor="accent5" w:themeTint="99"/>
           <w:sz w:val="32"/>
           <w:szCs w:val="32"/>
@@ -6307,8 +5878,6 @@
       <w:r>
         <w:rPr>
           <w:rFonts w:cs="Calibri"/>
-          <w:b/>
-          <w:bCs/>
           <w:color w:val="D86DCB" w:themeColor="accent5" w:themeTint="99"/>
           <w:sz w:val="32"/>
           <w:szCs w:val="32"/>
@@ -6319,8 +5888,6 @@
       <w:r>
         <w:rPr>
           <w:rFonts w:cs="Calibri"/>
-          <w:b/>
-          <w:bCs/>
           <w:color w:val="D86DCB" w:themeColor="accent5" w:themeTint="99"/>
           <w:sz w:val="32"/>
           <w:szCs w:val="32"/>
@@ -6332,8 +5899,6 @@
       <w:r>
         <w:rPr>
           <w:rFonts w:cs="Calibri"/>
-          <w:b/>
-          <w:bCs/>
           <w:color w:val="D86DCB" w:themeColor="accent5" w:themeTint="99"/>
           <w:sz w:val="32"/>
           <w:szCs w:val="32"/>
@@ -6346,18 +5911,14 @@
         <w:jc w:val="both"/>
         <w:rPr>
           <w:rFonts w:cs="Calibri"/>
-          <w:b/>
-          <w:bCs/>
-          <w:color w:val="D86DCB" w:themeColor="accent5" w:themeTint="99"/>
-          <w:sz w:val="32"/>
-          <w:szCs w:val="32"/>
-        </w:rPr>
-      </w:pPr>
-      <w:r>
-        <w:rPr>
-          <w:rFonts w:cs="Calibri"/>
-          <w:b/>
-          <w:bCs/>
+          <w:color w:val="D86DCB" w:themeColor="accent5" w:themeTint="99"/>
+          <w:sz w:val="32"/>
+          <w:szCs w:val="32"/>
+        </w:rPr>
+      </w:pPr>
+      <w:r>
+        <w:rPr>
+          <w:rFonts w:cs="Calibri"/>
           <w:color w:val="D86DCB" w:themeColor="accent5" w:themeTint="99"/>
           <w:sz w:val="32"/>
           <w:szCs w:val="32"/>
@@ -6368,8 +5929,6 @@
       <w:r>
         <w:rPr>
           <w:rFonts w:cs="Calibri"/>
-          <w:b/>
-          <w:bCs/>
           <w:color w:val="D86DCB" w:themeColor="accent5" w:themeTint="99"/>
           <w:sz w:val="32"/>
           <w:szCs w:val="32"/>
@@ -6380,8 +5939,6 @@
       <w:r>
         <w:rPr>
           <w:rFonts w:cs="Calibri"/>
-          <w:b/>
-          <w:bCs/>
           <w:color w:val="D86DCB" w:themeColor="accent5" w:themeTint="99"/>
           <w:sz w:val="32"/>
           <w:szCs w:val="32"/>
@@ -6394,18 +5951,14 @@
         <w:jc w:val="both"/>
         <w:rPr>
           <w:rFonts w:cs="Calibri"/>
-          <w:b/>
-          <w:bCs/>
-          <w:color w:val="D86DCB" w:themeColor="accent5" w:themeTint="99"/>
-          <w:sz w:val="32"/>
-          <w:szCs w:val="32"/>
-        </w:rPr>
-      </w:pPr>
-      <w:r>
-        <w:rPr>
-          <w:rFonts w:cs="Calibri"/>
-          <w:b/>
-          <w:bCs/>
+          <w:color w:val="D86DCB" w:themeColor="accent5" w:themeTint="99"/>
+          <w:sz w:val="32"/>
+          <w:szCs w:val="32"/>
+        </w:rPr>
+      </w:pPr>
+      <w:r>
+        <w:rPr>
+          <w:rFonts w:cs="Calibri"/>
           <w:color w:val="D86DCB" w:themeColor="accent5" w:themeTint="99"/>
           <w:sz w:val="32"/>
           <w:szCs w:val="32"/>

</xml_diff>